<commit_message>
Actualizacion del manual de instalación y configuración - TANI
</commit_message>
<xml_diff>
--- a/TP2. E11 Manual de Instalación y Configuración TANI.docx
+++ b/TP2. E11 Manual de Instalación y Configuración TANI.docx
@@ -69,97 +69,1038 @@
         </w:rPr>
         <w:t>:</w:t>
       </w:r>
+    </w:p>
+    <w:p>
+      <w:pPr>
+        <w:spacing w:after="0" w:line="240" w:lineRule="auto"/>
+        <w:jc w:val="right"/>
+        <w:rPr>
+          <w:lang w:eastAsia="es-PE"/>
+        </w:rPr>
+      </w:pPr>
+      <w:r>
+        <w:rPr>
+          <w:b/>
+          <w:bCs/>
+          <w:lang w:eastAsia="es-PE"/>
+        </w:rPr>
+        <w:t>Versión</w:t>
+      </w:r>
+      <w:r>
+        <w:rPr>
+          <w:lang w:eastAsia="es-PE"/>
+        </w:rPr>
+        <w:t>: 1.0</w:t>
+      </w:r>
+    </w:p>
+    <w:p>
+      <w:pPr>
+        <w:pStyle w:val="Ttulo1"/>
+      </w:pPr>
+      <w:r>
+        <w:t xml:space="preserve">1. </w:t>
+      </w:r>
+      <w:r>
+        <w:t>Introd</w:t>
+      </w:r>
       <w:bookmarkStart w:id="0" w:name="_GoBack"/>
       <w:bookmarkEnd w:id="0"/>
-    </w:p>
-    <w:p>
-      <w:pPr>
-        <w:spacing w:after="0" w:line="240" w:lineRule="auto"/>
-        <w:jc w:val="right"/>
-        <w:rPr>
-          <w:lang w:eastAsia="es-PE"/>
-        </w:rPr>
-      </w:pPr>
+      <w:r>
+        <w:t>ucción</w:t>
+      </w:r>
+    </w:p>
+    <w:p>
+      <w:pPr>
+        <w:rPr>
+          <w:lang w:eastAsia="es-PE"/>
+        </w:rPr>
+      </w:pPr>
+      <w:r>
+        <w:rPr>
+          <w:lang w:eastAsia="es-PE"/>
+        </w:rPr>
+        <w:t xml:space="preserve">Este documento proporciona las instrucciones detalladas para la instalación, configuración y despliegue del sistema </w:t>
+      </w:r>
+      <w:proofErr w:type="spellStart"/>
       <w:r>
         <w:rPr>
           <w:b/>
           <w:bCs/>
           <w:lang w:eastAsia="es-PE"/>
         </w:rPr>
-        <w:t>Versión</w:t>
-      </w:r>
-      <w:r>
-        <w:rPr>
-          <w:lang w:eastAsia="es-PE"/>
-        </w:rPr>
-        <w:t>: 1.0</w:t>
+        <w:t>Tani</w:t>
+      </w:r>
+      <w:proofErr w:type="spellEnd"/>
+      <w:r>
+        <w:rPr>
+          <w:lang w:eastAsia="es-PE"/>
+        </w:rPr>
+        <w:t xml:space="preserve"> en un entorno de desarrollo local. Se dirige a administradores del sistema, personal técnico o desarrolladores que deban implementar la solución.</w:t>
       </w:r>
     </w:p>
     <w:p>
       <w:pPr>
         <w:pStyle w:val="Ttulo1"/>
-      </w:pPr>
-      <w:r>
-        <w:t xml:space="preserve">1. </w:t>
-      </w:r>
-      <w:r>
-        <w:t>Introducción</w:t>
-      </w:r>
-    </w:p>
-    <w:p>
-      <w:pPr>
-        <w:rPr>
-          <w:lang w:eastAsia="es-PE"/>
-        </w:rPr>
-      </w:pPr>
-      <w:r>
-        <w:rPr>
-          <w:lang w:eastAsia="es-PE"/>
-        </w:rPr>
-        <w:t xml:space="preserve">Este documento proporciona las instrucciones detalladas para la instalación, configuración y despliegue del sistema </w:t>
-      </w:r>
-      <w:proofErr w:type="spellStart"/>
-      <w:r>
+        <w:rPr>
+          <w:u w:val="single"/>
+        </w:rPr>
+      </w:pPr>
+      <w:r>
+        <w:t>2. Requisitos del Sistema</w:t>
+      </w:r>
+    </w:p>
+    <w:p>
+      <w:pPr>
         <w:rPr>
           <w:b/>
           <w:bCs/>
           <w:lang w:eastAsia="es-PE"/>
         </w:rPr>
-        <w:t>Tani</w:t>
-      </w:r>
-      <w:proofErr w:type="spellEnd"/>
-      <w:r>
-        <w:rPr>
-          <w:lang w:eastAsia="es-PE"/>
-        </w:rPr>
-        <w:t xml:space="preserve"> en un entorno de desarrollo local. Se dirige a administradores del sistema, personal técnico o desarrolladores que deban implementar la solución.</w:t>
-      </w:r>
-    </w:p>
-    <w:p>
-      <w:pPr>
-        <w:pStyle w:val="Ttulo1"/>
-      </w:pPr>
-      <w:r>
-        <w:t>2. Requisitos del Sistema</w:t>
-      </w:r>
-    </w:p>
-    <w:p>
-      <w:pPr>
+      </w:pPr>
+      <w:r>
         <w:rPr>
           <w:b/>
           <w:bCs/>
           <w:lang w:eastAsia="es-PE"/>
         </w:rPr>
-      </w:pPr>
-      <w:r>
+        <w:t>2.1 Requisitos de Software</w:t>
+      </w:r>
+    </w:p>
+    <w:p>
+      <w:pPr>
         <w:rPr>
           <w:b/>
           <w:bCs/>
           <w:lang w:eastAsia="es-PE"/>
         </w:rPr>
-        <w:t>2.1 Requisitos de Software</w:t>
-      </w:r>
-    </w:p>
+      </w:pPr>
+    </w:p>
+    <w:tbl>
+      <w:tblPr>
+        <w:tblW w:w="0" w:type="auto"/>
+        <w:tblCellSpacing w:w="15" w:type="dxa"/>
+        <w:tblCellMar>
+          <w:left w:w="0" w:type="dxa"/>
+          <w:right w:w="0" w:type="dxa"/>
+        </w:tblCellMar>
+        <w:tblLook w:val="04A0" w:firstRow="1" w:lastRow="0" w:firstColumn="1" w:lastColumn="0" w:noHBand="0" w:noVBand="1"/>
+      </w:tblPr>
+      <w:tblGrid>
+        <w:gridCol w:w="2540"/>
+        <w:gridCol w:w="2870"/>
+        <w:gridCol w:w="3078"/>
+      </w:tblGrid>
+      <w:tr>
+        <w:trPr>
+          <w:tblHeader/>
+          <w:tblCellSpacing w:w="15" w:type="dxa"/>
+        </w:trPr>
+        <w:tc>
+          <w:tcPr>
+            <w:tcW w:w="0" w:type="auto"/>
+            <w:tcBorders>
+              <w:top w:val="single" w:sz="6" w:space="0" w:color="auto"/>
+              <w:left w:val="single" w:sz="6" w:space="0" w:color="auto"/>
+              <w:bottom w:val="single" w:sz="6" w:space="0" w:color="auto"/>
+              <w:right w:val="single" w:sz="6" w:space="0" w:color="auto"/>
+            </w:tcBorders>
+            <w:tcMar>
+              <w:top w:w="120" w:type="dxa"/>
+              <w:left w:w="180" w:type="dxa"/>
+              <w:bottom w:w="120" w:type="dxa"/>
+              <w:right w:w="180" w:type="dxa"/>
+            </w:tcMar>
+            <w:vAlign w:val="center"/>
+            <w:hideMark/>
+          </w:tcPr>
+          <w:p>
+            <w:pPr>
+              <w:spacing w:after="0" w:line="240" w:lineRule="auto"/>
+              <w:jc w:val="left"/>
+              <w:rPr>
+                <w:rFonts w:ascii="Times New Roman" w:eastAsia="Times New Roman" w:hAnsi="Times New Roman" w:cs="Times New Roman"/>
+                <w:color w:val="1F1F1F"/>
+                <w:lang w:eastAsia="es-PE"/>
+              </w:rPr>
+            </w:pPr>
+            <w:r>
+              <w:rPr>
+                <w:rFonts w:ascii="Times New Roman" w:eastAsia="Times New Roman" w:hAnsi="Times New Roman" w:cs="Times New Roman"/>
+                <w:b/>
+                <w:bCs/>
+                <w:color w:val="1F1F1F"/>
+                <w:bdr w:val="none" w:sz="0" w:space="0" w:color="auto" w:frame="1"/>
+                <w:lang w:eastAsia="es-PE"/>
+              </w:rPr>
+              <w:t>Componente</w:t>
+            </w:r>
+          </w:p>
+        </w:tc>
+        <w:tc>
+          <w:tcPr>
+            <w:tcW w:w="0" w:type="auto"/>
+            <w:tcBorders>
+              <w:top w:val="single" w:sz="6" w:space="0" w:color="auto"/>
+              <w:left w:val="single" w:sz="6" w:space="0" w:color="auto"/>
+              <w:bottom w:val="single" w:sz="6" w:space="0" w:color="auto"/>
+              <w:right w:val="single" w:sz="6" w:space="0" w:color="auto"/>
+            </w:tcBorders>
+            <w:tcMar>
+              <w:top w:w="120" w:type="dxa"/>
+              <w:left w:w="180" w:type="dxa"/>
+              <w:bottom w:w="120" w:type="dxa"/>
+              <w:right w:w="180" w:type="dxa"/>
+            </w:tcMar>
+            <w:vAlign w:val="center"/>
+            <w:hideMark/>
+          </w:tcPr>
+          <w:p>
+            <w:pPr>
+              <w:spacing w:after="0" w:line="240" w:lineRule="auto"/>
+              <w:jc w:val="left"/>
+              <w:rPr>
+                <w:rFonts w:ascii="Times New Roman" w:eastAsia="Times New Roman" w:hAnsi="Times New Roman" w:cs="Times New Roman"/>
+                <w:color w:val="1F1F1F"/>
+                <w:lang w:eastAsia="es-PE"/>
+              </w:rPr>
+            </w:pPr>
+            <w:r>
+              <w:rPr>
+                <w:rFonts w:ascii="Times New Roman" w:eastAsia="Times New Roman" w:hAnsi="Times New Roman" w:cs="Times New Roman"/>
+                <w:b/>
+                <w:bCs/>
+                <w:color w:val="1F1F1F"/>
+                <w:bdr w:val="none" w:sz="0" w:space="0" w:color="auto" w:frame="1"/>
+                <w:lang w:eastAsia="es-PE"/>
+              </w:rPr>
+              <w:t>Versión / Detalle</w:t>
+            </w:r>
+          </w:p>
+        </w:tc>
+        <w:tc>
+          <w:tcPr>
+            <w:tcW w:w="0" w:type="auto"/>
+            <w:tcBorders>
+              <w:top w:val="single" w:sz="6" w:space="0" w:color="auto"/>
+              <w:left w:val="single" w:sz="6" w:space="0" w:color="auto"/>
+              <w:bottom w:val="single" w:sz="6" w:space="0" w:color="auto"/>
+              <w:right w:val="single" w:sz="6" w:space="0" w:color="auto"/>
+            </w:tcBorders>
+            <w:tcMar>
+              <w:top w:w="120" w:type="dxa"/>
+              <w:left w:w="180" w:type="dxa"/>
+              <w:bottom w:w="120" w:type="dxa"/>
+              <w:right w:w="180" w:type="dxa"/>
+            </w:tcMar>
+            <w:vAlign w:val="center"/>
+            <w:hideMark/>
+          </w:tcPr>
+          <w:p>
+            <w:pPr>
+              <w:spacing w:after="0" w:line="240" w:lineRule="auto"/>
+              <w:jc w:val="left"/>
+              <w:rPr>
+                <w:rFonts w:ascii="Times New Roman" w:eastAsia="Times New Roman" w:hAnsi="Times New Roman" w:cs="Times New Roman"/>
+                <w:color w:val="1F1F1F"/>
+                <w:lang w:eastAsia="es-PE"/>
+              </w:rPr>
+            </w:pPr>
+            <w:r>
+              <w:rPr>
+                <w:rFonts w:ascii="Times New Roman" w:eastAsia="Times New Roman" w:hAnsi="Times New Roman" w:cs="Times New Roman"/>
+                <w:b/>
+                <w:bCs/>
+                <w:color w:val="1F1F1F"/>
+                <w:bdr w:val="none" w:sz="0" w:space="0" w:color="auto" w:frame="1"/>
+                <w:lang w:eastAsia="es-PE"/>
+              </w:rPr>
+              <w:t>Descripción</w:t>
+            </w:r>
+          </w:p>
+        </w:tc>
+      </w:tr>
+      <w:tr>
+        <w:trPr>
+          <w:tblCellSpacing w:w="15" w:type="dxa"/>
+        </w:trPr>
+        <w:tc>
+          <w:tcPr>
+            <w:tcW w:w="0" w:type="auto"/>
+            <w:tcBorders>
+              <w:top w:val="single" w:sz="6" w:space="0" w:color="auto"/>
+              <w:left w:val="single" w:sz="6" w:space="0" w:color="auto"/>
+              <w:bottom w:val="single" w:sz="6" w:space="0" w:color="auto"/>
+              <w:right w:val="single" w:sz="6" w:space="0" w:color="auto"/>
+            </w:tcBorders>
+            <w:tcMar>
+              <w:top w:w="120" w:type="dxa"/>
+              <w:left w:w="180" w:type="dxa"/>
+              <w:bottom w:w="120" w:type="dxa"/>
+              <w:right w:w="180" w:type="dxa"/>
+            </w:tcMar>
+            <w:vAlign w:val="center"/>
+            <w:hideMark/>
+          </w:tcPr>
+          <w:p>
+            <w:pPr>
+              <w:spacing w:after="0" w:line="240" w:lineRule="auto"/>
+              <w:jc w:val="left"/>
+              <w:rPr>
+                <w:rFonts w:ascii="Times New Roman" w:eastAsia="Times New Roman" w:hAnsi="Times New Roman" w:cs="Times New Roman"/>
+                <w:color w:val="1F1F1F"/>
+                <w:lang w:eastAsia="es-PE"/>
+              </w:rPr>
+            </w:pPr>
+            <w:r>
+              <w:rPr>
+                <w:rFonts w:ascii="Times New Roman" w:eastAsia="Times New Roman" w:hAnsi="Times New Roman" w:cs="Times New Roman"/>
+                <w:b/>
+                <w:bCs/>
+                <w:color w:val="1F1F1F"/>
+                <w:bdr w:val="none" w:sz="0" w:space="0" w:color="auto" w:frame="1"/>
+                <w:lang w:eastAsia="es-PE"/>
+              </w:rPr>
+              <w:t>Sistema Operativo</w:t>
+            </w:r>
+          </w:p>
+        </w:tc>
+        <w:tc>
+          <w:tcPr>
+            <w:tcW w:w="0" w:type="auto"/>
+            <w:tcBorders>
+              <w:top w:val="single" w:sz="6" w:space="0" w:color="auto"/>
+              <w:left w:val="single" w:sz="6" w:space="0" w:color="auto"/>
+              <w:bottom w:val="single" w:sz="6" w:space="0" w:color="auto"/>
+              <w:right w:val="single" w:sz="6" w:space="0" w:color="auto"/>
+            </w:tcBorders>
+            <w:tcMar>
+              <w:top w:w="120" w:type="dxa"/>
+              <w:left w:w="180" w:type="dxa"/>
+              <w:bottom w:w="120" w:type="dxa"/>
+              <w:right w:w="180" w:type="dxa"/>
+            </w:tcMar>
+            <w:vAlign w:val="center"/>
+            <w:hideMark/>
+          </w:tcPr>
+          <w:p>
+            <w:pPr>
+              <w:spacing w:after="0" w:line="240" w:lineRule="auto"/>
+              <w:jc w:val="left"/>
+              <w:rPr>
+                <w:rFonts w:ascii="Times New Roman" w:eastAsia="Times New Roman" w:hAnsi="Times New Roman" w:cs="Times New Roman"/>
+                <w:color w:val="1F1F1F"/>
+                <w:lang w:eastAsia="es-PE"/>
+              </w:rPr>
+            </w:pPr>
+            <w:r>
+              <w:rPr>
+                <w:rFonts w:ascii="Times New Roman" w:eastAsia="Times New Roman" w:hAnsi="Times New Roman" w:cs="Times New Roman"/>
+                <w:color w:val="1F1F1F"/>
+                <w:bdr w:val="none" w:sz="0" w:space="0" w:color="auto" w:frame="1"/>
+                <w:lang w:eastAsia="es-PE"/>
+              </w:rPr>
+              <w:t>Windows 10 o superior</w:t>
+            </w:r>
+          </w:p>
+        </w:tc>
+        <w:tc>
+          <w:tcPr>
+            <w:tcW w:w="0" w:type="auto"/>
+            <w:tcBorders>
+              <w:top w:val="single" w:sz="6" w:space="0" w:color="auto"/>
+              <w:left w:val="single" w:sz="6" w:space="0" w:color="auto"/>
+              <w:bottom w:val="single" w:sz="6" w:space="0" w:color="auto"/>
+              <w:right w:val="single" w:sz="6" w:space="0" w:color="auto"/>
+            </w:tcBorders>
+            <w:tcMar>
+              <w:top w:w="120" w:type="dxa"/>
+              <w:left w:w="180" w:type="dxa"/>
+              <w:bottom w:w="120" w:type="dxa"/>
+              <w:right w:w="180" w:type="dxa"/>
+            </w:tcMar>
+            <w:vAlign w:val="center"/>
+            <w:hideMark/>
+          </w:tcPr>
+          <w:p>
+            <w:pPr>
+              <w:spacing w:after="0" w:line="240" w:lineRule="auto"/>
+              <w:jc w:val="left"/>
+              <w:rPr>
+                <w:rFonts w:ascii="Times New Roman" w:eastAsia="Times New Roman" w:hAnsi="Times New Roman" w:cs="Times New Roman"/>
+                <w:color w:val="1F1F1F"/>
+                <w:lang w:eastAsia="es-PE"/>
+              </w:rPr>
+            </w:pPr>
+            <w:r>
+              <w:rPr>
+                <w:rFonts w:ascii="Times New Roman" w:eastAsia="Times New Roman" w:hAnsi="Times New Roman" w:cs="Times New Roman"/>
+                <w:color w:val="1F1F1F"/>
+                <w:bdr w:val="none" w:sz="0" w:space="0" w:color="auto" w:frame="1"/>
+                <w:lang w:eastAsia="es-PE"/>
+              </w:rPr>
+              <w:t>Ambiente local de ejecución</w:t>
+            </w:r>
+          </w:p>
+        </w:tc>
+      </w:tr>
+      <w:tr>
+        <w:trPr>
+          <w:tblCellSpacing w:w="15" w:type="dxa"/>
+        </w:trPr>
+        <w:tc>
+          <w:tcPr>
+            <w:tcW w:w="0" w:type="auto"/>
+            <w:tcBorders>
+              <w:top w:val="single" w:sz="6" w:space="0" w:color="auto"/>
+              <w:left w:val="single" w:sz="6" w:space="0" w:color="auto"/>
+              <w:bottom w:val="single" w:sz="6" w:space="0" w:color="auto"/>
+              <w:right w:val="single" w:sz="6" w:space="0" w:color="auto"/>
+            </w:tcBorders>
+            <w:tcMar>
+              <w:top w:w="120" w:type="dxa"/>
+              <w:left w:w="180" w:type="dxa"/>
+              <w:bottom w:w="120" w:type="dxa"/>
+              <w:right w:w="180" w:type="dxa"/>
+            </w:tcMar>
+            <w:vAlign w:val="center"/>
+            <w:hideMark/>
+          </w:tcPr>
+          <w:p>
+            <w:pPr>
+              <w:spacing w:after="0" w:line="240" w:lineRule="auto"/>
+              <w:jc w:val="left"/>
+              <w:rPr>
+                <w:rFonts w:ascii="Times New Roman" w:eastAsia="Times New Roman" w:hAnsi="Times New Roman" w:cs="Times New Roman"/>
+                <w:color w:val="1F1F1F"/>
+                <w:lang w:eastAsia="es-PE"/>
+              </w:rPr>
+            </w:pPr>
+            <w:r>
+              <w:rPr>
+                <w:rFonts w:ascii="Times New Roman" w:eastAsia="Times New Roman" w:hAnsi="Times New Roman" w:cs="Times New Roman"/>
+                <w:b/>
+                <w:bCs/>
+                <w:color w:val="1F1F1F"/>
+                <w:bdr w:val="none" w:sz="0" w:space="0" w:color="auto" w:frame="1"/>
+                <w:lang w:eastAsia="es-PE"/>
+              </w:rPr>
+              <w:t xml:space="preserve">Java </w:t>
+            </w:r>
+            <w:proofErr w:type="spellStart"/>
+            <w:r>
+              <w:rPr>
+                <w:rFonts w:ascii="Times New Roman" w:eastAsia="Times New Roman" w:hAnsi="Times New Roman" w:cs="Times New Roman"/>
+                <w:b/>
+                <w:bCs/>
+                <w:color w:val="1F1F1F"/>
+                <w:bdr w:val="none" w:sz="0" w:space="0" w:color="auto" w:frame="1"/>
+                <w:lang w:eastAsia="es-PE"/>
+              </w:rPr>
+              <w:t>Development</w:t>
+            </w:r>
+            <w:proofErr w:type="spellEnd"/>
+            <w:r>
+              <w:rPr>
+                <w:rFonts w:ascii="Times New Roman" w:eastAsia="Times New Roman" w:hAnsi="Times New Roman" w:cs="Times New Roman"/>
+                <w:b/>
+                <w:bCs/>
+                <w:color w:val="1F1F1F"/>
+                <w:bdr w:val="none" w:sz="0" w:space="0" w:color="auto" w:frame="1"/>
+                <w:lang w:eastAsia="es-PE"/>
+              </w:rPr>
+              <w:t xml:space="preserve"> Kit (JDK)</w:t>
+            </w:r>
+          </w:p>
+        </w:tc>
+        <w:tc>
+          <w:tcPr>
+            <w:tcW w:w="0" w:type="auto"/>
+            <w:tcBorders>
+              <w:top w:val="single" w:sz="6" w:space="0" w:color="auto"/>
+              <w:left w:val="single" w:sz="6" w:space="0" w:color="auto"/>
+              <w:bottom w:val="single" w:sz="6" w:space="0" w:color="auto"/>
+              <w:right w:val="single" w:sz="6" w:space="0" w:color="auto"/>
+            </w:tcBorders>
+            <w:tcMar>
+              <w:top w:w="120" w:type="dxa"/>
+              <w:left w:w="180" w:type="dxa"/>
+              <w:bottom w:w="120" w:type="dxa"/>
+              <w:right w:w="180" w:type="dxa"/>
+            </w:tcMar>
+            <w:vAlign w:val="center"/>
+            <w:hideMark/>
+          </w:tcPr>
+          <w:p>
+            <w:pPr>
+              <w:spacing w:after="0" w:line="240" w:lineRule="auto"/>
+              <w:jc w:val="left"/>
+              <w:rPr>
+                <w:rFonts w:ascii="Times New Roman" w:eastAsia="Times New Roman" w:hAnsi="Times New Roman" w:cs="Times New Roman"/>
+                <w:color w:val="1F1F1F"/>
+                <w:lang w:eastAsia="es-PE"/>
+              </w:rPr>
+            </w:pPr>
+            <w:r>
+              <w:rPr>
+                <w:rFonts w:ascii="Times New Roman" w:eastAsia="Times New Roman" w:hAnsi="Times New Roman" w:cs="Times New Roman"/>
+                <w:color w:val="1F1F1F"/>
+                <w:bdr w:val="none" w:sz="0" w:space="0" w:color="auto" w:frame="1"/>
+                <w:lang w:eastAsia="es-PE"/>
+              </w:rPr>
+              <w:t>Versión 17.0.12</w:t>
+            </w:r>
+          </w:p>
+        </w:tc>
+        <w:tc>
+          <w:tcPr>
+            <w:tcW w:w="0" w:type="auto"/>
+            <w:tcBorders>
+              <w:top w:val="single" w:sz="6" w:space="0" w:color="auto"/>
+              <w:left w:val="single" w:sz="6" w:space="0" w:color="auto"/>
+              <w:bottom w:val="single" w:sz="6" w:space="0" w:color="auto"/>
+              <w:right w:val="single" w:sz="6" w:space="0" w:color="auto"/>
+            </w:tcBorders>
+            <w:tcMar>
+              <w:top w:w="120" w:type="dxa"/>
+              <w:left w:w="180" w:type="dxa"/>
+              <w:bottom w:w="120" w:type="dxa"/>
+              <w:right w:w="180" w:type="dxa"/>
+            </w:tcMar>
+            <w:vAlign w:val="center"/>
+            <w:hideMark/>
+          </w:tcPr>
+          <w:p>
+            <w:pPr>
+              <w:spacing w:after="0" w:line="240" w:lineRule="auto"/>
+              <w:jc w:val="left"/>
+              <w:rPr>
+                <w:rFonts w:ascii="Times New Roman" w:eastAsia="Times New Roman" w:hAnsi="Times New Roman" w:cs="Times New Roman"/>
+                <w:color w:val="1F1F1F"/>
+                <w:lang w:eastAsia="es-PE"/>
+              </w:rPr>
+            </w:pPr>
+            <w:r>
+              <w:rPr>
+                <w:rFonts w:ascii="Times New Roman" w:eastAsia="Times New Roman" w:hAnsi="Times New Roman" w:cs="Times New Roman"/>
+                <w:color w:val="1F1F1F"/>
+                <w:bdr w:val="none" w:sz="0" w:space="0" w:color="auto" w:frame="1"/>
+                <w:lang w:eastAsia="es-PE"/>
+              </w:rPr>
+              <w:t>Requerido para ejecutar el archivo .</w:t>
+            </w:r>
+            <w:proofErr w:type="spellStart"/>
+            <w:r>
+              <w:rPr>
+                <w:rFonts w:ascii="Times New Roman" w:eastAsia="Times New Roman" w:hAnsi="Times New Roman" w:cs="Times New Roman"/>
+                <w:color w:val="1F1F1F"/>
+                <w:bdr w:val="none" w:sz="0" w:space="0" w:color="auto" w:frame="1"/>
+                <w:lang w:eastAsia="es-PE"/>
+              </w:rPr>
+              <w:t>jar</w:t>
+            </w:r>
+            <w:proofErr w:type="spellEnd"/>
+          </w:p>
+        </w:tc>
+      </w:tr>
+      <w:tr>
+        <w:trPr>
+          <w:tblCellSpacing w:w="15" w:type="dxa"/>
+        </w:trPr>
+        <w:tc>
+          <w:tcPr>
+            <w:tcW w:w="0" w:type="auto"/>
+            <w:tcBorders>
+              <w:top w:val="single" w:sz="6" w:space="0" w:color="auto"/>
+              <w:left w:val="single" w:sz="6" w:space="0" w:color="auto"/>
+              <w:bottom w:val="single" w:sz="6" w:space="0" w:color="auto"/>
+              <w:right w:val="single" w:sz="6" w:space="0" w:color="auto"/>
+            </w:tcBorders>
+            <w:tcMar>
+              <w:top w:w="120" w:type="dxa"/>
+              <w:left w:w="180" w:type="dxa"/>
+              <w:bottom w:w="120" w:type="dxa"/>
+              <w:right w:w="180" w:type="dxa"/>
+            </w:tcMar>
+            <w:vAlign w:val="center"/>
+            <w:hideMark/>
+          </w:tcPr>
+          <w:p>
+            <w:pPr>
+              <w:spacing w:after="0" w:line="240" w:lineRule="auto"/>
+              <w:jc w:val="left"/>
+              <w:rPr>
+                <w:rFonts w:ascii="Times New Roman" w:eastAsia="Times New Roman" w:hAnsi="Times New Roman" w:cs="Times New Roman"/>
+                <w:color w:val="1F1F1F"/>
+                <w:lang w:eastAsia="es-PE"/>
+              </w:rPr>
+            </w:pPr>
+            <w:r>
+              <w:rPr>
+                <w:rFonts w:ascii="Times New Roman" w:eastAsia="Times New Roman" w:hAnsi="Times New Roman" w:cs="Times New Roman"/>
+                <w:b/>
+                <w:bCs/>
+                <w:color w:val="1F1F1F"/>
+                <w:bdr w:val="none" w:sz="0" w:space="0" w:color="auto" w:frame="1"/>
+                <w:lang w:eastAsia="es-PE"/>
+              </w:rPr>
+              <w:t>Servidor de Base de Datos</w:t>
+            </w:r>
+          </w:p>
+        </w:tc>
+        <w:tc>
+          <w:tcPr>
+            <w:tcW w:w="0" w:type="auto"/>
+            <w:tcBorders>
+              <w:top w:val="single" w:sz="6" w:space="0" w:color="auto"/>
+              <w:left w:val="single" w:sz="6" w:space="0" w:color="auto"/>
+              <w:bottom w:val="single" w:sz="6" w:space="0" w:color="auto"/>
+              <w:right w:val="single" w:sz="6" w:space="0" w:color="auto"/>
+            </w:tcBorders>
+            <w:tcMar>
+              <w:top w:w="120" w:type="dxa"/>
+              <w:left w:w="180" w:type="dxa"/>
+              <w:bottom w:w="120" w:type="dxa"/>
+              <w:right w:w="180" w:type="dxa"/>
+            </w:tcMar>
+            <w:vAlign w:val="center"/>
+            <w:hideMark/>
+          </w:tcPr>
+          <w:p>
+            <w:pPr>
+              <w:spacing w:after="0" w:line="240" w:lineRule="auto"/>
+              <w:jc w:val="left"/>
+              <w:rPr>
+                <w:rFonts w:ascii="Times New Roman" w:eastAsia="Times New Roman" w:hAnsi="Times New Roman" w:cs="Times New Roman"/>
+                <w:color w:val="1F1F1F"/>
+                <w:lang w:eastAsia="es-PE"/>
+              </w:rPr>
+            </w:pPr>
+            <w:r>
+              <w:rPr>
+                <w:rFonts w:ascii="Times New Roman" w:eastAsia="Times New Roman" w:hAnsi="Times New Roman" w:cs="Times New Roman"/>
+                <w:color w:val="1F1F1F"/>
+                <w:bdr w:val="none" w:sz="0" w:space="0" w:color="auto" w:frame="1"/>
+                <w:lang w:eastAsia="es-PE"/>
+              </w:rPr>
+              <w:t>MySQL 8.0 o superior</w:t>
+            </w:r>
+          </w:p>
+        </w:tc>
+        <w:tc>
+          <w:tcPr>
+            <w:tcW w:w="0" w:type="auto"/>
+            <w:tcBorders>
+              <w:top w:val="single" w:sz="6" w:space="0" w:color="auto"/>
+              <w:left w:val="single" w:sz="6" w:space="0" w:color="auto"/>
+              <w:bottom w:val="single" w:sz="6" w:space="0" w:color="auto"/>
+              <w:right w:val="single" w:sz="6" w:space="0" w:color="auto"/>
+            </w:tcBorders>
+            <w:tcMar>
+              <w:top w:w="120" w:type="dxa"/>
+              <w:left w:w="180" w:type="dxa"/>
+              <w:bottom w:w="120" w:type="dxa"/>
+              <w:right w:w="180" w:type="dxa"/>
+            </w:tcMar>
+            <w:vAlign w:val="center"/>
+            <w:hideMark/>
+          </w:tcPr>
+          <w:p>
+            <w:pPr>
+              <w:spacing w:after="0" w:line="240" w:lineRule="auto"/>
+              <w:jc w:val="left"/>
+              <w:rPr>
+                <w:rFonts w:ascii="Times New Roman" w:eastAsia="Times New Roman" w:hAnsi="Times New Roman" w:cs="Times New Roman"/>
+                <w:color w:val="1F1F1F"/>
+                <w:lang w:eastAsia="es-PE"/>
+              </w:rPr>
+            </w:pPr>
+            <w:r>
+              <w:rPr>
+                <w:rFonts w:ascii="Times New Roman" w:eastAsia="Times New Roman" w:hAnsi="Times New Roman" w:cs="Times New Roman"/>
+                <w:color w:val="1F1F1F"/>
+                <w:bdr w:val="none" w:sz="0" w:space="0" w:color="auto" w:frame="1"/>
+                <w:lang w:eastAsia="es-PE"/>
+              </w:rPr>
+              <w:t>Servicio corriendo en puerto 3306</w:t>
+            </w:r>
+          </w:p>
+        </w:tc>
+      </w:tr>
+      <w:tr>
+        <w:trPr>
+          <w:tblCellSpacing w:w="15" w:type="dxa"/>
+        </w:trPr>
+        <w:tc>
+          <w:tcPr>
+            <w:tcW w:w="0" w:type="auto"/>
+            <w:tcBorders>
+              <w:top w:val="single" w:sz="6" w:space="0" w:color="auto"/>
+              <w:left w:val="single" w:sz="6" w:space="0" w:color="auto"/>
+              <w:bottom w:val="single" w:sz="6" w:space="0" w:color="auto"/>
+              <w:right w:val="single" w:sz="6" w:space="0" w:color="auto"/>
+            </w:tcBorders>
+            <w:tcMar>
+              <w:top w:w="120" w:type="dxa"/>
+              <w:left w:w="180" w:type="dxa"/>
+              <w:bottom w:w="120" w:type="dxa"/>
+              <w:right w:w="180" w:type="dxa"/>
+            </w:tcMar>
+            <w:vAlign w:val="center"/>
+            <w:hideMark/>
+          </w:tcPr>
+          <w:p>
+            <w:pPr>
+              <w:spacing w:after="0" w:line="240" w:lineRule="auto"/>
+              <w:jc w:val="left"/>
+              <w:rPr>
+                <w:rFonts w:ascii="Times New Roman" w:eastAsia="Times New Roman" w:hAnsi="Times New Roman" w:cs="Times New Roman"/>
+                <w:color w:val="1F1F1F"/>
+                <w:lang w:eastAsia="es-PE"/>
+              </w:rPr>
+            </w:pPr>
+            <w:r>
+              <w:rPr>
+                <w:rFonts w:ascii="Times New Roman" w:eastAsia="Times New Roman" w:hAnsi="Times New Roman" w:cs="Times New Roman"/>
+                <w:b/>
+                <w:bCs/>
+                <w:color w:val="1F1F1F"/>
+                <w:bdr w:val="none" w:sz="0" w:space="0" w:color="auto" w:frame="1"/>
+                <w:lang w:eastAsia="es-PE"/>
+              </w:rPr>
+              <w:t>Navegador Web</w:t>
+            </w:r>
+          </w:p>
+        </w:tc>
+        <w:tc>
+          <w:tcPr>
+            <w:tcW w:w="0" w:type="auto"/>
+            <w:tcBorders>
+              <w:top w:val="single" w:sz="6" w:space="0" w:color="auto"/>
+              <w:left w:val="single" w:sz="6" w:space="0" w:color="auto"/>
+              <w:bottom w:val="single" w:sz="6" w:space="0" w:color="auto"/>
+              <w:right w:val="single" w:sz="6" w:space="0" w:color="auto"/>
+            </w:tcBorders>
+            <w:tcMar>
+              <w:top w:w="120" w:type="dxa"/>
+              <w:left w:w="180" w:type="dxa"/>
+              <w:bottom w:w="120" w:type="dxa"/>
+              <w:right w:w="180" w:type="dxa"/>
+            </w:tcMar>
+            <w:vAlign w:val="center"/>
+            <w:hideMark/>
+          </w:tcPr>
+          <w:p>
+            <w:pPr>
+              <w:spacing w:after="0" w:line="240" w:lineRule="auto"/>
+              <w:jc w:val="left"/>
+              <w:rPr>
+                <w:rFonts w:ascii="Times New Roman" w:eastAsia="Times New Roman" w:hAnsi="Times New Roman" w:cs="Times New Roman"/>
+                <w:color w:val="1F1F1F"/>
+                <w:lang w:eastAsia="es-PE"/>
+              </w:rPr>
+            </w:pPr>
+            <w:r>
+              <w:rPr>
+                <w:rFonts w:ascii="Times New Roman" w:eastAsia="Times New Roman" w:hAnsi="Times New Roman" w:cs="Times New Roman"/>
+                <w:color w:val="1F1F1F"/>
+                <w:bdr w:val="none" w:sz="0" w:space="0" w:color="auto" w:frame="1"/>
+                <w:lang w:eastAsia="es-PE"/>
+              </w:rPr>
+              <w:t>Google Chrome, Edge o Firefox</w:t>
+            </w:r>
+          </w:p>
+        </w:tc>
+        <w:tc>
+          <w:tcPr>
+            <w:tcW w:w="0" w:type="auto"/>
+            <w:tcBorders>
+              <w:top w:val="single" w:sz="6" w:space="0" w:color="auto"/>
+              <w:left w:val="single" w:sz="6" w:space="0" w:color="auto"/>
+              <w:bottom w:val="single" w:sz="6" w:space="0" w:color="auto"/>
+              <w:right w:val="single" w:sz="6" w:space="0" w:color="auto"/>
+            </w:tcBorders>
+            <w:tcMar>
+              <w:top w:w="120" w:type="dxa"/>
+              <w:left w:w="180" w:type="dxa"/>
+              <w:bottom w:w="120" w:type="dxa"/>
+              <w:right w:w="180" w:type="dxa"/>
+            </w:tcMar>
+            <w:vAlign w:val="center"/>
+            <w:hideMark/>
+          </w:tcPr>
+          <w:p>
+            <w:pPr>
+              <w:spacing w:after="0" w:line="240" w:lineRule="auto"/>
+              <w:jc w:val="left"/>
+              <w:rPr>
+                <w:rFonts w:ascii="Times New Roman" w:eastAsia="Times New Roman" w:hAnsi="Times New Roman" w:cs="Times New Roman"/>
+                <w:color w:val="1F1F1F"/>
+                <w:lang w:eastAsia="es-PE"/>
+              </w:rPr>
+            </w:pPr>
+            <w:r>
+              <w:rPr>
+                <w:rFonts w:ascii="Times New Roman" w:eastAsia="Times New Roman" w:hAnsi="Times New Roman" w:cs="Times New Roman"/>
+                <w:color w:val="1F1F1F"/>
+                <w:bdr w:val="none" w:sz="0" w:space="0" w:color="auto" w:frame="1"/>
+                <w:lang w:eastAsia="es-PE"/>
+              </w:rPr>
+              <w:t>Para acceder al sistema vía localhost:9090</w:t>
+            </w:r>
+          </w:p>
+        </w:tc>
+      </w:tr>
+      <w:tr>
+        <w:trPr>
+          <w:tblCellSpacing w:w="15" w:type="dxa"/>
+        </w:trPr>
+        <w:tc>
+          <w:tcPr>
+            <w:tcW w:w="0" w:type="auto"/>
+            <w:tcBorders>
+              <w:top w:val="single" w:sz="6" w:space="0" w:color="auto"/>
+              <w:left w:val="single" w:sz="6" w:space="0" w:color="auto"/>
+              <w:bottom w:val="single" w:sz="6" w:space="0" w:color="auto"/>
+              <w:right w:val="single" w:sz="6" w:space="0" w:color="auto"/>
+            </w:tcBorders>
+            <w:tcMar>
+              <w:top w:w="120" w:type="dxa"/>
+              <w:left w:w="180" w:type="dxa"/>
+              <w:bottom w:w="120" w:type="dxa"/>
+              <w:right w:w="180" w:type="dxa"/>
+            </w:tcMar>
+            <w:vAlign w:val="center"/>
+            <w:hideMark/>
+          </w:tcPr>
+          <w:p>
+            <w:pPr>
+              <w:spacing w:after="0" w:line="240" w:lineRule="auto"/>
+              <w:jc w:val="left"/>
+              <w:rPr>
+                <w:rFonts w:ascii="Times New Roman" w:eastAsia="Times New Roman" w:hAnsi="Times New Roman" w:cs="Times New Roman"/>
+                <w:color w:val="1F1F1F"/>
+                <w:lang w:eastAsia="es-PE"/>
+              </w:rPr>
+            </w:pPr>
+            <w:r>
+              <w:rPr>
+                <w:rFonts w:ascii="Times New Roman" w:eastAsia="Times New Roman" w:hAnsi="Times New Roman" w:cs="Times New Roman"/>
+                <w:b/>
+                <w:bCs/>
+                <w:color w:val="1F1F1F"/>
+                <w:bdr w:val="none" w:sz="0" w:space="0" w:color="auto" w:frame="1"/>
+                <w:lang w:eastAsia="es-PE"/>
+              </w:rPr>
+              <w:t>Archivo Ejecutable</w:t>
+            </w:r>
+          </w:p>
+        </w:tc>
+        <w:tc>
+          <w:tcPr>
+            <w:tcW w:w="0" w:type="auto"/>
+            <w:tcBorders>
+              <w:top w:val="single" w:sz="6" w:space="0" w:color="auto"/>
+              <w:left w:val="single" w:sz="6" w:space="0" w:color="auto"/>
+              <w:bottom w:val="single" w:sz="6" w:space="0" w:color="auto"/>
+              <w:right w:val="single" w:sz="6" w:space="0" w:color="auto"/>
+            </w:tcBorders>
+            <w:tcMar>
+              <w:top w:w="120" w:type="dxa"/>
+              <w:left w:w="180" w:type="dxa"/>
+              <w:bottom w:w="120" w:type="dxa"/>
+              <w:right w:w="180" w:type="dxa"/>
+            </w:tcMar>
+            <w:vAlign w:val="center"/>
+            <w:hideMark/>
+          </w:tcPr>
+          <w:p>
+            <w:pPr>
+              <w:spacing w:after="0" w:line="240" w:lineRule="auto"/>
+              <w:jc w:val="left"/>
+              <w:rPr>
+                <w:rFonts w:ascii="Times New Roman" w:eastAsia="Times New Roman" w:hAnsi="Times New Roman" w:cs="Times New Roman"/>
+                <w:color w:val="1F1F1F"/>
+                <w:lang w:eastAsia="es-PE"/>
+              </w:rPr>
+            </w:pPr>
+            <w:r>
+              <w:rPr>
+                <w:rFonts w:ascii="Times New Roman" w:eastAsia="Times New Roman" w:hAnsi="Times New Roman" w:cs="Times New Roman"/>
+                <w:color w:val="1F1F1F"/>
+                <w:bdr w:val="none" w:sz="0" w:space="0" w:color="auto" w:frame="1"/>
+                <w:lang w:eastAsia="es-PE"/>
+              </w:rPr>
+              <w:t>BancoDeLeche-1.0.0.jar</w:t>
+            </w:r>
+          </w:p>
+        </w:tc>
+        <w:tc>
+          <w:tcPr>
+            <w:tcW w:w="0" w:type="auto"/>
+            <w:tcBorders>
+              <w:top w:val="single" w:sz="6" w:space="0" w:color="auto"/>
+              <w:left w:val="single" w:sz="6" w:space="0" w:color="auto"/>
+              <w:bottom w:val="single" w:sz="6" w:space="0" w:color="auto"/>
+              <w:right w:val="single" w:sz="6" w:space="0" w:color="auto"/>
+            </w:tcBorders>
+            <w:tcMar>
+              <w:top w:w="120" w:type="dxa"/>
+              <w:left w:w="180" w:type="dxa"/>
+              <w:bottom w:w="120" w:type="dxa"/>
+              <w:right w:w="180" w:type="dxa"/>
+            </w:tcMar>
+            <w:vAlign w:val="center"/>
+            <w:hideMark/>
+          </w:tcPr>
+          <w:p>
+            <w:pPr>
+              <w:spacing w:after="0" w:line="240" w:lineRule="auto"/>
+              <w:jc w:val="left"/>
+              <w:rPr>
+                <w:rFonts w:ascii="Times New Roman" w:eastAsia="Times New Roman" w:hAnsi="Times New Roman" w:cs="Times New Roman"/>
+                <w:color w:val="1F1F1F"/>
+                <w:lang w:eastAsia="es-PE"/>
+              </w:rPr>
+            </w:pPr>
+            <w:r>
+              <w:rPr>
+                <w:rFonts w:ascii="Times New Roman" w:eastAsia="Times New Roman" w:hAnsi="Times New Roman" w:cs="Times New Roman"/>
+                <w:color w:val="1F1F1F"/>
+                <w:bdr w:val="none" w:sz="0" w:space="0" w:color="auto" w:frame="1"/>
+                <w:lang w:eastAsia="es-PE"/>
+              </w:rPr>
+              <w:t>Contiene la aplicación</w:t>
+            </w:r>
+          </w:p>
+        </w:tc>
+      </w:tr>
+      <w:tr>
+        <w:trPr>
+          <w:tblCellSpacing w:w="15" w:type="dxa"/>
+        </w:trPr>
+        <w:tc>
+          <w:tcPr>
+            <w:tcW w:w="0" w:type="auto"/>
+            <w:tcBorders>
+              <w:top w:val="single" w:sz="6" w:space="0" w:color="auto"/>
+              <w:left w:val="single" w:sz="6" w:space="0" w:color="auto"/>
+              <w:bottom w:val="single" w:sz="6" w:space="0" w:color="auto"/>
+              <w:right w:val="single" w:sz="6" w:space="0" w:color="auto"/>
+            </w:tcBorders>
+            <w:tcMar>
+              <w:top w:w="120" w:type="dxa"/>
+              <w:left w:w="180" w:type="dxa"/>
+              <w:bottom w:w="120" w:type="dxa"/>
+              <w:right w:w="180" w:type="dxa"/>
+            </w:tcMar>
+            <w:vAlign w:val="center"/>
+            <w:hideMark/>
+          </w:tcPr>
+          <w:p>
+            <w:pPr>
+              <w:spacing w:after="0" w:line="240" w:lineRule="auto"/>
+              <w:jc w:val="left"/>
+              <w:rPr>
+                <w:rFonts w:ascii="Times New Roman" w:eastAsia="Times New Roman" w:hAnsi="Times New Roman" w:cs="Times New Roman"/>
+                <w:color w:val="1F1F1F"/>
+                <w:lang w:eastAsia="es-PE"/>
+              </w:rPr>
+            </w:pPr>
+            <w:r>
+              <w:rPr>
+                <w:rFonts w:ascii="Times New Roman" w:eastAsia="Times New Roman" w:hAnsi="Times New Roman" w:cs="Times New Roman"/>
+                <w:b/>
+                <w:bCs/>
+                <w:color w:val="1F1F1F"/>
+                <w:bdr w:val="none" w:sz="0" w:space="0" w:color="auto" w:frame="1"/>
+                <w:lang w:eastAsia="es-PE"/>
+              </w:rPr>
+              <w:t>Script de Base de Datos</w:t>
+            </w:r>
+          </w:p>
+        </w:tc>
+        <w:tc>
+          <w:tcPr>
+            <w:tcW w:w="0" w:type="auto"/>
+            <w:tcBorders>
+              <w:top w:val="single" w:sz="6" w:space="0" w:color="auto"/>
+              <w:left w:val="single" w:sz="6" w:space="0" w:color="auto"/>
+              <w:bottom w:val="single" w:sz="6" w:space="0" w:color="auto"/>
+              <w:right w:val="single" w:sz="6" w:space="0" w:color="auto"/>
+            </w:tcBorders>
+            <w:tcMar>
+              <w:top w:w="120" w:type="dxa"/>
+              <w:left w:w="180" w:type="dxa"/>
+              <w:bottom w:w="120" w:type="dxa"/>
+              <w:right w:w="180" w:type="dxa"/>
+            </w:tcMar>
+            <w:vAlign w:val="center"/>
+            <w:hideMark/>
+          </w:tcPr>
+          <w:p>
+            <w:pPr>
+              <w:spacing w:after="0" w:line="240" w:lineRule="auto"/>
+              <w:jc w:val="left"/>
+              <w:rPr>
+                <w:rFonts w:ascii="Times New Roman" w:eastAsia="Times New Roman" w:hAnsi="Times New Roman" w:cs="Times New Roman"/>
+                <w:color w:val="1F1F1F"/>
+                <w:lang w:eastAsia="es-PE"/>
+              </w:rPr>
+            </w:pPr>
+            <w:proofErr w:type="spellStart"/>
+            <w:r>
+              <w:rPr>
+                <w:rFonts w:ascii="Times New Roman" w:eastAsia="Times New Roman" w:hAnsi="Times New Roman" w:cs="Times New Roman"/>
+                <w:color w:val="1F1F1F"/>
+                <w:bdr w:val="none" w:sz="0" w:space="0" w:color="auto" w:frame="1"/>
+                <w:lang w:eastAsia="es-PE"/>
+              </w:rPr>
+              <w:t>bancodelechedb.sql</w:t>
+            </w:r>
+            <w:proofErr w:type="spellEnd"/>
+          </w:p>
+        </w:tc>
+        <w:tc>
+          <w:tcPr>
+            <w:tcW w:w="0" w:type="auto"/>
+            <w:tcBorders>
+              <w:top w:val="single" w:sz="6" w:space="0" w:color="auto"/>
+              <w:left w:val="single" w:sz="6" w:space="0" w:color="auto"/>
+              <w:bottom w:val="single" w:sz="6" w:space="0" w:color="auto"/>
+              <w:right w:val="single" w:sz="6" w:space="0" w:color="auto"/>
+            </w:tcBorders>
+            <w:tcMar>
+              <w:top w:w="120" w:type="dxa"/>
+              <w:left w:w="180" w:type="dxa"/>
+              <w:bottom w:w="120" w:type="dxa"/>
+              <w:right w:w="180" w:type="dxa"/>
+            </w:tcMar>
+            <w:vAlign w:val="center"/>
+            <w:hideMark/>
+          </w:tcPr>
+          <w:p>
+            <w:pPr>
+              <w:spacing w:after="0" w:line="240" w:lineRule="auto"/>
+              <w:jc w:val="left"/>
+              <w:rPr>
+                <w:rFonts w:ascii="Times New Roman" w:eastAsia="Times New Roman" w:hAnsi="Times New Roman" w:cs="Times New Roman"/>
+                <w:color w:val="1F1F1F"/>
+                <w:lang w:eastAsia="es-PE"/>
+              </w:rPr>
+            </w:pPr>
+            <w:r>
+              <w:rPr>
+                <w:rFonts w:ascii="Times New Roman" w:eastAsia="Times New Roman" w:hAnsi="Times New Roman" w:cs="Times New Roman"/>
+                <w:color w:val="1F1F1F"/>
+                <w:bdr w:val="none" w:sz="0" w:space="0" w:color="auto" w:frame="1"/>
+                <w:lang w:eastAsia="es-PE"/>
+              </w:rPr>
+              <w:t>Crea todas las tablas del sistema</w:t>
+            </w:r>
+          </w:p>
+        </w:tc>
+      </w:tr>
+    </w:tbl>
     <w:p>
       <w:pPr>
         <w:rPr>
@@ -168,48 +1109,15 @@
           <w:lang w:eastAsia="es-PE"/>
         </w:rPr>
       </w:pPr>
-      <w:r>
+    </w:p>
+    <w:p>
+      <w:pPr>
         <w:rPr>
           <w:b/>
           <w:bCs/>
           <w:lang w:eastAsia="es-PE"/>
         </w:rPr>
-        <w:drawing>
-          <wp:inline distT="0" distB="0" distL="0" distR="0" wp14:anchorId="7432E43C" wp14:editId="3E7E0CF0">
-            <wp:extent cx="5400040" cy="3385820"/>
-            <wp:effectExtent l="0" t="0" r="0" b="5080"/>
-            <wp:docPr id="1" name="Imagen 1"/>
-            <wp:cNvGraphicFramePr>
-              <a:graphicFrameLocks xmlns:a="http://schemas.openxmlformats.org/drawingml/2006/main" noChangeAspect="1"/>
-            </wp:cNvGraphicFramePr>
-            <a:graphic xmlns:a="http://schemas.openxmlformats.org/drawingml/2006/main">
-              <a:graphicData uri="http://schemas.openxmlformats.org/drawingml/2006/picture">
-                <pic:pic xmlns:pic="http://schemas.openxmlformats.org/drawingml/2006/picture">
-                  <pic:nvPicPr>
-                    <pic:cNvPr id="1" name=""/>
-                    <pic:cNvPicPr/>
-                  </pic:nvPicPr>
-                  <pic:blipFill>
-                    <a:blip r:embed="rId5"/>
-                    <a:stretch>
-                      <a:fillRect/>
-                    </a:stretch>
-                  </pic:blipFill>
-                  <pic:spPr>
-                    <a:xfrm>
-                      <a:off x="0" y="0"/>
-                      <a:ext cx="5400040" cy="3385820"/>
-                    </a:xfrm>
-                    <a:prstGeom prst="rect">
-                      <a:avLst/>
-                    </a:prstGeom>
-                  </pic:spPr>
-                </pic:pic>
-              </a:graphicData>
-            </a:graphic>
-          </wp:inline>
-        </w:drawing>
-      </w:r>
+      </w:pPr>
     </w:p>
     <w:p>
       <w:pPr>
@@ -246,15 +1154,15 @@
           <w:lang w:eastAsia="es-PE"/>
         </w:rPr>
       </w:pPr>
-    </w:p>
-    <w:p>
-      <w:pPr>
+      <w:r>
         <w:rPr>
           <w:b/>
           <w:bCs/>
           <w:lang w:eastAsia="es-PE"/>
         </w:rPr>
-      </w:pPr>
+        <w:lastRenderedPageBreak/>
+        <w:t>2.2 Requisitos de Hardware (mínimos)</w:t>
+      </w:r>
     </w:p>
     <w:p>
       <w:pPr>
@@ -264,75 +1172,831 @@
           <w:lang w:eastAsia="es-PE"/>
         </w:rPr>
       </w:pPr>
-      <w:r>
+    </w:p>
+    <w:tbl>
+      <w:tblPr>
+        <w:tblW w:w="0" w:type="auto"/>
+        <w:tblCellSpacing w:w="15" w:type="dxa"/>
+        <w:tblCellMar>
+          <w:left w:w="0" w:type="dxa"/>
+          <w:right w:w="0" w:type="dxa"/>
+        </w:tblCellMar>
+        <w:tblLook w:val="04A0" w:firstRow="1" w:lastRow="0" w:firstColumn="1" w:lastColumn="0" w:noHBand="0" w:noVBand="1"/>
+      </w:tblPr>
+      <w:tblGrid>
+        <w:gridCol w:w="2229"/>
+        <w:gridCol w:w="2920"/>
+        <w:gridCol w:w="3339"/>
+      </w:tblGrid>
+      <w:tr>
+        <w:trPr>
+          <w:tblHeader/>
+          <w:tblCellSpacing w:w="15" w:type="dxa"/>
+        </w:trPr>
+        <w:tc>
+          <w:tcPr>
+            <w:tcW w:w="0" w:type="auto"/>
+            <w:tcBorders>
+              <w:top w:val="single" w:sz="6" w:space="0" w:color="auto"/>
+              <w:left w:val="single" w:sz="6" w:space="0" w:color="auto"/>
+              <w:bottom w:val="single" w:sz="6" w:space="0" w:color="auto"/>
+              <w:right w:val="single" w:sz="6" w:space="0" w:color="auto"/>
+            </w:tcBorders>
+            <w:tcMar>
+              <w:top w:w="120" w:type="dxa"/>
+              <w:left w:w="180" w:type="dxa"/>
+              <w:bottom w:w="120" w:type="dxa"/>
+              <w:right w:w="180" w:type="dxa"/>
+            </w:tcMar>
+            <w:vAlign w:val="center"/>
+            <w:hideMark/>
+          </w:tcPr>
+          <w:p>
+            <w:pPr>
+              <w:spacing w:after="0" w:line="240" w:lineRule="auto"/>
+              <w:jc w:val="left"/>
+              <w:rPr>
+                <w:rFonts w:ascii="Times New Roman" w:eastAsia="Times New Roman" w:hAnsi="Times New Roman" w:cs="Times New Roman"/>
+                <w:color w:val="1F1F1F"/>
+                <w:lang w:eastAsia="es-PE"/>
+              </w:rPr>
+            </w:pPr>
+            <w:r>
+              <w:rPr>
+                <w:rFonts w:ascii="Times New Roman" w:eastAsia="Times New Roman" w:hAnsi="Times New Roman" w:cs="Times New Roman"/>
+                <w:b/>
+                <w:bCs/>
+                <w:color w:val="1F1F1F"/>
+                <w:bdr w:val="none" w:sz="0" w:space="0" w:color="auto" w:frame="1"/>
+                <w:lang w:eastAsia="es-PE"/>
+              </w:rPr>
+              <w:t>Componente</w:t>
+            </w:r>
+          </w:p>
+        </w:tc>
+        <w:tc>
+          <w:tcPr>
+            <w:tcW w:w="0" w:type="auto"/>
+            <w:tcBorders>
+              <w:top w:val="single" w:sz="6" w:space="0" w:color="auto"/>
+              <w:left w:val="single" w:sz="6" w:space="0" w:color="auto"/>
+              <w:bottom w:val="single" w:sz="6" w:space="0" w:color="auto"/>
+              <w:right w:val="single" w:sz="6" w:space="0" w:color="auto"/>
+            </w:tcBorders>
+            <w:tcMar>
+              <w:top w:w="120" w:type="dxa"/>
+              <w:left w:w="180" w:type="dxa"/>
+              <w:bottom w:w="120" w:type="dxa"/>
+              <w:right w:w="180" w:type="dxa"/>
+            </w:tcMar>
+            <w:vAlign w:val="center"/>
+            <w:hideMark/>
+          </w:tcPr>
+          <w:p>
+            <w:pPr>
+              <w:spacing w:after="0" w:line="240" w:lineRule="auto"/>
+              <w:jc w:val="left"/>
+              <w:rPr>
+                <w:rFonts w:ascii="Times New Roman" w:eastAsia="Times New Roman" w:hAnsi="Times New Roman" w:cs="Times New Roman"/>
+                <w:color w:val="1F1F1F"/>
+                <w:lang w:eastAsia="es-PE"/>
+              </w:rPr>
+            </w:pPr>
+            <w:r>
+              <w:rPr>
+                <w:rFonts w:ascii="Times New Roman" w:eastAsia="Times New Roman" w:hAnsi="Times New Roman" w:cs="Times New Roman"/>
+                <w:b/>
+                <w:bCs/>
+                <w:color w:val="1F1F1F"/>
+                <w:bdr w:val="none" w:sz="0" w:space="0" w:color="auto" w:frame="1"/>
+                <w:lang w:eastAsia="es-PE"/>
+              </w:rPr>
+              <w:t>Requisito Mínimo</w:t>
+            </w:r>
+          </w:p>
+        </w:tc>
+        <w:tc>
+          <w:tcPr>
+            <w:tcW w:w="0" w:type="auto"/>
+            <w:tcBorders>
+              <w:top w:val="single" w:sz="6" w:space="0" w:color="auto"/>
+              <w:left w:val="single" w:sz="6" w:space="0" w:color="auto"/>
+              <w:bottom w:val="single" w:sz="6" w:space="0" w:color="auto"/>
+              <w:right w:val="single" w:sz="6" w:space="0" w:color="auto"/>
+            </w:tcBorders>
+            <w:tcMar>
+              <w:top w:w="120" w:type="dxa"/>
+              <w:left w:w="180" w:type="dxa"/>
+              <w:bottom w:w="120" w:type="dxa"/>
+              <w:right w:w="180" w:type="dxa"/>
+            </w:tcMar>
+            <w:vAlign w:val="center"/>
+            <w:hideMark/>
+          </w:tcPr>
+          <w:p>
+            <w:pPr>
+              <w:spacing w:after="0" w:line="240" w:lineRule="auto"/>
+              <w:jc w:val="left"/>
+              <w:rPr>
+                <w:rFonts w:ascii="Times New Roman" w:eastAsia="Times New Roman" w:hAnsi="Times New Roman" w:cs="Times New Roman"/>
+                <w:color w:val="1F1F1F"/>
+                <w:lang w:eastAsia="es-PE"/>
+              </w:rPr>
+            </w:pPr>
+            <w:r>
+              <w:rPr>
+                <w:rFonts w:ascii="Times New Roman" w:eastAsia="Times New Roman" w:hAnsi="Times New Roman" w:cs="Times New Roman"/>
+                <w:b/>
+                <w:bCs/>
+                <w:color w:val="1F1F1F"/>
+                <w:bdr w:val="none" w:sz="0" w:space="0" w:color="auto" w:frame="1"/>
+                <w:lang w:eastAsia="es-PE"/>
+              </w:rPr>
+              <w:t>Requisito Recomendado</w:t>
+            </w:r>
+          </w:p>
+        </w:tc>
+      </w:tr>
+      <w:tr>
+        <w:trPr>
+          <w:tblCellSpacing w:w="15" w:type="dxa"/>
+        </w:trPr>
+        <w:tc>
+          <w:tcPr>
+            <w:tcW w:w="0" w:type="auto"/>
+            <w:tcBorders>
+              <w:top w:val="single" w:sz="6" w:space="0" w:color="auto"/>
+              <w:left w:val="single" w:sz="6" w:space="0" w:color="auto"/>
+              <w:bottom w:val="single" w:sz="6" w:space="0" w:color="auto"/>
+              <w:right w:val="single" w:sz="6" w:space="0" w:color="auto"/>
+            </w:tcBorders>
+            <w:tcMar>
+              <w:top w:w="120" w:type="dxa"/>
+              <w:left w:w="180" w:type="dxa"/>
+              <w:bottom w:w="120" w:type="dxa"/>
+              <w:right w:w="180" w:type="dxa"/>
+            </w:tcMar>
+            <w:vAlign w:val="center"/>
+            <w:hideMark/>
+          </w:tcPr>
+          <w:p>
+            <w:pPr>
+              <w:spacing w:after="0" w:line="240" w:lineRule="auto"/>
+              <w:jc w:val="left"/>
+              <w:rPr>
+                <w:rFonts w:ascii="Times New Roman" w:eastAsia="Times New Roman" w:hAnsi="Times New Roman" w:cs="Times New Roman"/>
+                <w:color w:val="1F1F1F"/>
+                <w:lang w:eastAsia="es-PE"/>
+              </w:rPr>
+            </w:pPr>
+            <w:r>
+              <w:rPr>
+                <w:rFonts w:ascii="Times New Roman" w:eastAsia="Times New Roman" w:hAnsi="Times New Roman" w:cs="Times New Roman"/>
+                <w:b/>
+                <w:bCs/>
+                <w:color w:val="1F1F1F"/>
+                <w:bdr w:val="none" w:sz="0" w:space="0" w:color="auto" w:frame="1"/>
+                <w:lang w:eastAsia="es-PE"/>
+              </w:rPr>
+              <w:t>Procesador (CPU)</w:t>
+            </w:r>
+          </w:p>
+        </w:tc>
+        <w:tc>
+          <w:tcPr>
+            <w:tcW w:w="0" w:type="auto"/>
+            <w:tcBorders>
+              <w:top w:val="single" w:sz="6" w:space="0" w:color="auto"/>
+              <w:left w:val="single" w:sz="6" w:space="0" w:color="auto"/>
+              <w:bottom w:val="single" w:sz="6" w:space="0" w:color="auto"/>
+              <w:right w:val="single" w:sz="6" w:space="0" w:color="auto"/>
+            </w:tcBorders>
+            <w:tcMar>
+              <w:top w:w="120" w:type="dxa"/>
+              <w:left w:w="180" w:type="dxa"/>
+              <w:bottom w:w="120" w:type="dxa"/>
+              <w:right w:w="180" w:type="dxa"/>
+            </w:tcMar>
+            <w:vAlign w:val="center"/>
+            <w:hideMark/>
+          </w:tcPr>
+          <w:p>
+            <w:pPr>
+              <w:spacing w:after="0" w:line="240" w:lineRule="auto"/>
+              <w:jc w:val="left"/>
+              <w:rPr>
+                <w:rFonts w:ascii="Times New Roman" w:eastAsia="Times New Roman" w:hAnsi="Times New Roman" w:cs="Times New Roman"/>
+                <w:color w:val="1F1F1F"/>
+                <w:lang w:eastAsia="es-PE"/>
+              </w:rPr>
+            </w:pPr>
+            <w:r>
+              <w:rPr>
+                <w:rFonts w:ascii="Times New Roman" w:eastAsia="Times New Roman" w:hAnsi="Times New Roman" w:cs="Times New Roman"/>
+                <w:color w:val="1F1F1F"/>
+                <w:bdr w:val="none" w:sz="0" w:space="0" w:color="auto" w:frame="1"/>
+                <w:lang w:eastAsia="es-PE"/>
+              </w:rPr>
+              <w:t>Intel Core i3 (10ª generación o equivalente)</w:t>
+            </w:r>
+          </w:p>
+        </w:tc>
+        <w:tc>
+          <w:tcPr>
+            <w:tcW w:w="0" w:type="auto"/>
+            <w:tcBorders>
+              <w:top w:val="single" w:sz="6" w:space="0" w:color="auto"/>
+              <w:left w:val="single" w:sz="6" w:space="0" w:color="auto"/>
+              <w:bottom w:val="single" w:sz="6" w:space="0" w:color="auto"/>
+              <w:right w:val="single" w:sz="6" w:space="0" w:color="auto"/>
+            </w:tcBorders>
+            <w:tcMar>
+              <w:top w:w="120" w:type="dxa"/>
+              <w:left w:w="180" w:type="dxa"/>
+              <w:bottom w:w="120" w:type="dxa"/>
+              <w:right w:w="180" w:type="dxa"/>
+            </w:tcMar>
+            <w:vAlign w:val="center"/>
+            <w:hideMark/>
+          </w:tcPr>
+          <w:p>
+            <w:pPr>
+              <w:spacing w:after="0" w:line="240" w:lineRule="auto"/>
+              <w:jc w:val="left"/>
+              <w:rPr>
+                <w:rFonts w:ascii="Times New Roman" w:eastAsia="Times New Roman" w:hAnsi="Times New Roman" w:cs="Times New Roman"/>
+                <w:color w:val="1F1F1F"/>
+                <w:lang w:eastAsia="es-PE"/>
+              </w:rPr>
+            </w:pPr>
+            <w:r>
+              <w:rPr>
+                <w:rFonts w:ascii="Times New Roman" w:eastAsia="Times New Roman" w:hAnsi="Times New Roman" w:cs="Times New Roman"/>
+                <w:color w:val="1F1F1F"/>
+                <w:bdr w:val="none" w:sz="0" w:space="0" w:color="auto" w:frame="1"/>
+                <w:lang w:eastAsia="es-PE"/>
+              </w:rPr>
+              <w:t>Intel Core i5 o superior</w:t>
+            </w:r>
+          </w:p>
+        </w:tc>
+      </w:tr>
+      <w:tr>
+        <w:trPr>
+          <w:tblCellSpacing w:w="15" w:type="dxa"/>
+        </w:trPr>
+        <w:tc>
+          <w:tcPr>
+            <w:tcW w:w="0" w:type="auto"/>
+            <w:tcBorders>
+              <w:top w:val="single" w:sz="6" w:space="0" w:color="auto"/>
+              <w:left w:val="single" w:sz="6" w:space="0" w:color="auto"/>
+              <w:bottom w:val="single" w:sz="6" w:space="0" w:color="auto"/>
+              <w:right w:val="single" w:sz="6" w:space="0" w:color="auto"/>
+            </w:tcBorders>
+            <w:tcMar>
+              <w:top w:w="120" w:type="dxa"/>
+              <w:left w:w="180" w:type="dxa"/>
+              <w:bottom w:w="120" w:type="dxa"/>
+              <w:right w:w="180" w:type="dxa"/>
+            </w:tcMar>
+            <w:vAlign w:val="center"/>
+            <w:hideMark/>
+          </w:tcPr>
+          <w:p>
+            <w:pPr>
+              <w:spacing w:after="0" w:line="240" w:lineRule="auto"/>
+              <w:jc w:val="left"/>
+              <w:rPr>
+                <w:rFonts w:ascii="Times New Roman" w:eastAsia="Times New Roman" w:hAnsi="Times New Roman" w:cs="Times New Roman"/>
+                <w:color w:val="1F1F1F"/>
+                <w:lang w:eastAsia="es-PE"/>
+              </w:rPr>
+            </w:pPr>
+            <w:r>
+              <w:rPr>
+                <w:rFonts w:ascii="Times New Roman" w:eastAsia="Times New Roman" w:hAnsi="Times New Roman" w:cs="Times New Roman"/>
+                <w:b/>
+                <w:bCs/>
+                <w:color w:val="1F1F1F"/>
+                <w:bdr w:val="none" w:sz="0" w:space="0" w:color="auto" w:frame="1"/>
+                <w:lang w:eastAsia="es-PE"/>
+              </w:rPr>
+              <w:t>Memoria RAM</w:t>
+            </w:r>
+          </w:p>
+        </w:tc>
+        <w:tc>
+          <w:tcPr>
+            <w:tcW w:w="0" w:type="auto"/>
+            <w:tcBorders>
+              <w:top w:val="single" w:sz="6" w:space="0" w:color="auto"/>
+              <w:left w:val="single" w:sz="6" w:space="0" w:color="auto"/>
+              <w:bottom w:val="single" w:sz="6" w:space="0" w:color="auto"/>
+              <w:right w:val="single" w:sz="6" w:space="0" w:color="auto"/>
+            </w:tcBorders>
+            <w:tcMar>
+              <w:top w:w="120" w:type="dxa"/>
+              <w:left w:w="180" w:type="dxa"/>
+              <w:bottom w:w="120" w:type="dxa"/>
+              <w:right w:w="180" w:type="dxa"/>
+            </w:tcMar>
+            <w:vAlign w:val="center"/>
+            <w:hideMark/>
+          </w:tcPr>
+          <w:p>
+            <w:pPr>
+              <w:spacing w:after="0" w:line="240" w:lineRule="auto"/>
+              <w:jc w:val="left"/>
+              <w:rPr>
+                <w:rFonts w:ascii="Times New Roman" w:eastAsia="Times New Roman" w:hAnsi="Times New Roman" w:cs="Times New Roman"/>
+                <w:color w:val="1F1F1F"/>
+                <w:lang w:eastAsia="es-PE"/>
+              </w:rPr>
+            </w:pPr>
+            <w:r>
+              <w:rPr>
+                <w:rFonts w:ascii="Times New Roman" w:eastAsia="Times New Roman" w:hAnsi="Times New Roman" w:cs="Times New Roman"/>
+                <w:color w:val="1F1F1F"/>
+                <w:bdr w:val="none" w:sz="0" w:space="0" w:color="auto" w:frame="1"/>
+                <w:lang w:eastAsia="es-PE"/>
+              </w:rPr>
+              <w:t>4 GB</w:t>
+            </w:r>
+          </w:p>
+        </w:tc>
+        <w:tc>
+          <w:tcPr>
+            <w:tcW w:w="0" w:type="auto"/>
+            <w:tcBorders>
+              <w:top w:val="single" w:sz="6" w:space="0" w:color="auto"/>
+              <w:left w:val="single" w:sz="6" w:space="0" w:color="auto"/>
+              <w:bottom w:val="single" w:sz="6" w:space="0" w:color="auto"/>
+              <w:right w:val="single" w:sz="6" w:space="0" w:color="auto"/>
+            </w:tcBorders>
+            <w:tcMar>
+              <w:top w:w="120" w:type="dxa"/>
+              <w:left w:w="180" w:type="dxa"/>
+              <w:bottom w:w="120" w:type="dxa"/>
+              <w:right w:w="180" w:type="dxa"/>
+            </w:tcMar>
+            <w:vAlign w:val="center"/>
+            <w:hideMark/>
+          </w:tcPr>
+          <w:p>
+            <w:pPr>
+              <w:spacing w:after="0" w:line="240" w:lineRule="auto"/>
+              <w:jc w:val="left"/>
+              <w:rPr>
+                <w:rFonts w:ascii="Times New Roman" w:eastAsia="Times New Roman" w:hAnsi="Times New Roman" w:cs="Times New Roman"/>
+                <w:color w:val="1F1F1F"/>
+                <w:lang w:eastAsia="es-PE"/>
+              </w:rPr>
+            </w:pPr>
+            <w:r>
+              <w:rPr>
+                <w:rFonts w:ascii="Times New Roman" w:eastAsia="Times New Roman" w:hAnsi="Times New Roman" w:cs="Times New Roman"/>
+                <w:color w:val="1F1F1F"/>
+                <w:bdr w:val="none" w:sz="0" w:space="0" w:color="auto" w:frame="1"/>
+                <w:lang w:eastAsia="es-PE"/>
+              </w:rPr>
+              <w:t>8 GB o más</w:t>
+            </w:r>
+          </w:p>
+        </w:tc>
+      </w:tr>
+      <w:tr>
+        <w:trPr>
+          <w:tblCellSpacing w:w="15" w:type="dxa"/>
+        </w:trPr>
+        <w:tc>
+          <w:tcPr>
+            <w:tcW w:w="0" w:type="auto"/>
+            <w:tcBorders>
+              <w:top w:val="single" w:sz="6" w:space="0" w:color="auto"/>
+              <w:left w:val="single" w:sz="6" w:space="0" w:color="auto"/>
+              <w:bottom w:val="single" w:sz="6" w:space="0" w:color="auto"/>
+              <w:right w:val="single" w:sz="6" w:space="0" w:color="auto"/>
+            </w:tcBorders>
+            <w:tcMar>
+              <w:top w:w="120" w:type="dxa"/>
+              <w:left w:w="180" w:type="dxa"/>
+              <w:bottom w:w="120" w:type="dxa"/>
+              <w:right w:w="180" w:type="dxa"/>
+            </w:tcMar>
+            <w:vAlign w:val="center"/>
+            <w:hideMark/>
+          </w:tcPr>
+          <w:p>
+            <w:pPr>
+              <w:spacing w:after="0" w:line="240" w:lineRule="auto"/>
+              <w:jc w:val="left"/>
+              <w:rPr>
+                <w:rFonts w:ascii="Times New Roman" w:eastAsia="Times New Roman" w:hAnsi="Times New Roman" w:cs="Times New Roman"/>
+                <w:color w:val="1F1F1F"/>
+                <w:lang w:eastAsia="es-PE"/>
+              </w:rPr>
+            </w:pPr>
+            <w:r>
+              <w:rPr>
+                <w:rFonts w:ascii="Times New Roman" w:eastAsia="Times New Roman" w:hAnsi="Times New Roman" w:cs="Times New Roman"/>
+                <w:b/>
+                <w:bCs/>
+                <w:color w:val="1F1F1F"/>
+                <w:bdr w:val="none" w:sz="0" w:space="0" w:color="auto" w:frame="1"/>
+                <w:lang w:eastAsia="es-PE"/>
+              </w:rPr>
+              <w:t>Almacenamiento</w:t>
+            </w:r>
+          </w:p>
+        </w:tc>
+        <w:tc>
+          <w:tcPr>
+            <w:tcW w:w="0" w:type="auto"/>
+            <w:tcBorders>
+              <w:top w:val="single" w:sz="6" w:space="0" w:color="auto"/>
+              <w:left w:val="single" w:sz="6" w:space="0" w:color="auto"/>
+              <w:bottom w:val="single" w:sz="6" w:space="0" w:color="auto"/>
+              <w:right w:val="single" w:sz="6" w:space="0" w:color="auto"/>
+            </w:tcBorders>
+            <w:tcMar>
+              <w:top w:w="120" w:type="dxa"/>
+              <w:left w:w="180" w:type="dxa"/>
+              <w:bottom w:w="120" w:type="dxa"/>
+              <w:right w:w="180" w:type="dxa"/>
+            </w:tcMar>
+            <w:vAlign w:val="center"/>
+            <w:hideMark/>
+          </w:tcPr>
+          <w:p>
+            <w:pPr>
+              <w:spacing w:after="0" w:line="240" w:lineRule="auto"/>
+              <w:jc w:val="left"/>
+              <w:rPr>
+                <w:rFonts w:ascii="Times New Roman" w:eastAsia="Times New Roman" w:hAnsi="Times New Roman" w:cs="Times New Roman"/>
+                <w:color w:val="1F1F1F"/>
+                <w:lang w:eastAsia="es-PE"/>
+              </w:rPr>
+            </w:pPr>
+            <w:r>
+              <w:rPr>
+                <w:rFonts w:ascii="Times New Roman" w:eastAsia="Times New Roman" w:hAnsi="Times New Roman" w:cs="Times New Roman"/>
+                <w:color w:val="1F1F1F"/>
+                <w:bdr w:val="none" w:sz="0" w:space="0" w:color="auto" w:frame="1"/>
+                <w:lang w:eastAsia="es-PE"/>
+              </w:rPr>
+              <w:t>2 GB de espacio libre en disco</w:t>
+            </w:r>
+          </w:p>
+        </w:tc>
+        <w:tc>
+          <w:tcPr>
+            <w:tcW w:w="0" w:type="auto"/>
+            <w:tcBorders>
+              <w:top w:val="single" w:sz="6" w:space="0" w:color="auto"/>
+              <w:left w:val="single" w:sz="6" w:space="0" w:color="auto"/>
+              <w:bottom w:val="single" w:sz="6" w:space="0" w:color="auto"/>
+              <w:right w:val="single" w:sz="6" w:space="0" w:color="auto"/>
+            </w:tcBorders>
+            <w:tcMar>
+              <w:top w:w="120" w:type="dxa"/>
+              <w:left w:w="180" w:type="dxa"/>
+              <w:bottom w:w="120" w:type="dxa"/>
+              <w:right w:w="180" w:type="dxa"/>
+            </w:tcMar>
+            <w:vAlign w:val="center"/>
+            <w:hideMark/>
+          </w:tcPr>
+          <w:p>
+            <w:pPr>
+              <w:spacing w:after="0" w:line="240" w:lineRule="auto"/>
+              <w:jc w:val="left"/>
+              <w:rPr>
+                <w:rFonts w:ascii="Times New Roman" w:eastAsia="Times New Roman" w:hAnsi="Times New Roman" w:cs="Times New Roman"/>
+                <w:color w:val="1F1F1F"/>
+                <w:lang w:eastAsia="es-PE"/>
+              </w:rPr>
+            </w:pPr>
+            <w:r>
+              <w:rPr>
+                <w:rFonts w:ascii="Times New Roman" w:eastAsia="Times New Roman" w:hAnsi="Times New Roman" w:cs="Times New Roman"/>
+                <w:color w:val="1F1F1F"/>
+                <w:bdr w:val="none" w:sz="0" w:space="0" w:color="auto" w:frame="1"/>
+                <w:lang w:eastAsia="es-PE"/>
+              </w:rPr>
+              <w:t>5 GB de espacio libre en SSD</w:t>
+            </w:r>
+          </w:p>
+        </w:tc>
+      </w:tr>
+      <w:tr>
+        <w:trPr>
+          <w:tblCellSpacing w:w="15" w:type="dxa"/>
+        </w:trPr>
+        <w:tc>
+          <w:tcPr>
+            <w:tcW w:w="0" w:type="auto"/>
+            <w:tcBorders>
+              <w:top w:val="single" w:sz="6" w:space="0" w:color="auto"/>
+              <w:left w:val="single" w:sz="6" w:space="0" w:color="auto"/>
+              <w:bottom w:val="single" w:sz="6" w:space="0" w:color="auto"/>
+              <w:right w:val="single" w:sz="6" w:space="0" w:color="auto"/>
+            </w:tcBorders>
+            <w:tcMar>
+              <w:top w:w="120" w:type="dxa"/>
+              <w:left w:w="180" w:type="dxa"/>
+              <w:bottom w:w="120" w:type="dxa"/>
+              <w:right w:w="180" w:type="dxa"/>
+            </w:tcMar>
+            <w:vAlign w:val="center"/>
+            <w:hideMark/>
+          </w:tcPr>
+          <w:p>
+            <w:pPr>
+              <w:spacing w:after="0" w:line="240" w:lineRule="auto"/>
+              <w:jc w:val="left"/>
+              <w:rPr>
+                <w:rFonts w:ascii="Times New Roman" w:eastAsia="Times New Roman" w:hAnsi="Times New Roman" w:cs="Times New Roman"/>
+                <w:color w:val="1F1F1F"/>
+                <w:lang w:eastAsia="es-PE"/>
+              </w:rPr>
+            </w:pPr>
+            <w:r>
+              <w:rPr>
+                <w:rFonts w:ascii="Times New Roman" w:eastAsia="Times New Roman" w:hAnsi="Times New Roman" w:cs="Times New Roman"/>
+                <w:b/>
+                <w:bCs/>
+                <w:color w:val="1F1F1F"/>
+                <w:bdr w:val="none" w:sz="0" w:space="0" w:color="auto" w:frame="1"/>
+                <w:lang w:eastAsia="es-PE"/>
+              </w:rPr>
+              <w:t>Pantalla</w:t>
+            </w:r>
+          </w:p>
+        </w:tc>
+        <w:tc>
+          <w:tcPr>
+            <w:tcW w:w="0" w:type="auto"/>
+            <w:tcBorders>
+              <w:top w:val="single" w:sz="6" w:space="0" w:color="auto"/>
+              <w:left w:val="single" w:sz="6" w:space="0" w:color="auto"/>
+              <w:bottom w:val="single" w:sz="6" w:space="0" w:color="auto"/>
+              <w:right w:val="single" w:sz="6" w:space="0" w:color="auto"/>
+            </w:tcBorders>
+            <w:tcMar>
+              <w:top w:w="120" w:type="dxa"/>
+              <w:left w:w="180" w:type="dxa"/>
+              <w:bottom w:w="120" w:type="dxa"/>
+              <w:right w:w="180" w:type="dxa"/>
+            </w:tcMar>
+            <w:vAlign w:val="center"/>
+            <w:hideMark/>
+          </w:tcPr>
+          <w:p>
+            <w:pPr>
+              <w:spacing w:after="0" w:line="240" w:lineRule="auto"/>
+              <w:jc w:val="left"/>
+              <w:rPr>
+                <w:rFonts w:ascii="Times New Roman" w:eastAsia="Times New Roman" w:hAnsi="Times New Roman" w:cs="Times New Roman"/>
+                <w:color w:val="1F1F1F"/>
+                <w:lang w:eastAsia="es-PE"/>
+              </w:rPr>
+            </w:pPr>
+            <w:r>
+              <w:rPr>
+                <w:rFonts w:ascii="Times New Roman" w:eastAsia="Times New Roman" w:hAnsi="Times New Roman" w:cs="Times New Roman"/>
+                <w:color w:val="1F1F1F"/>
+                <w:bdr w:val="none" w:sz="0" w:space="0" w:color="auto" w:frame="1"/>
+                <w:lang w:eastAsia="es-PE"/>
+              </w:rPr>
+              <w:t xml:space="preserve">Resolución mínima 1366x768 </w:t>
+            </w:r>
+            <w:proofErr w:type="spellStart"/>
+            <w:r>
+              <w:rPr>
+                <w:rFonts w:ascii="Times New Roman" w:eastAsia="Times New Roman" w:hAnsi="Times New Roman" w:cs="Times New Roman"/>
+                <w:color w:val="1F1F1F"/>
+                <w:bdr w:val="none" w:sz="0" w:space="0" w:color="auto" w:frame="1"/>
+                <w:lang w:eastAsia="es-PE"/>
+              </w:rPr>
+              <w:t>px</w:t>
+            </w:r>
+            <w:proofErr w:type="spellEnd"/>
+          </w:p>
+        </w:tc>
+        <w:tc>
+          <w:tcPr>
+            <w:tcW w:w="0" w:type="auto"/>
+            <w:tcBorders>
+              <w:top w:val="single" w:sz="6" w:space="0" w:color="auto"/>
+              <w:left w:val="single" w:sz="6" w:space="0" w:color="auto"/>
+              <w:bottom w:val="single" w:sz="6" w:space="0" w:color="auto"/>
+              <w:right w:val="single" w:sz="6" w:space="0" w:color="auto"/>
+            </w:tcBorders>
+            <w:tcMar>
+              <w:top w:w="120" w:type="dxa"/>
+              <w:left w:w="180" w:type="dxa"/>
+              <w:bottom w:w="120" w:type="dxa"/>
+              <w:right w:w="180" w:type="dxa"/>
+            </w:tcMar>
+            <w:vAlign w:val="center"/>
+            <w:hideMark/>
+          </w:tcPr>
+          <w:p>
+            <w:pPr>
+              <w:spacing w:after="0" w:line="240" w:lineRule="auto"/>
+              <w:jc w:val="left"/>
+              <w:rPr>
+                <w:rFonts w:ascii="Times New Roman" w:eastAsia="Times New Roman" w:hAnsi="Times New Roman" w:cs="Times New Roman"/>
+                <w:color w:val="1F1F1F"/>
+                <w:lang w:eastAsia="es-PE"/>
+              </w:rPr>
+            </w:pPr>
+            <w:r>
+              <w:rPr>
+                <w:rFonts w:ascii="Times New Roman" w:eastAsia="Times New Roman" w:hAnsi="Times New Roman" w:cs="Times New Roman"/>
+                <w:color w:val="1F1F1F"/>
+                <w:bdr w:val="none" w:sz="0" w:space="0" w:color="auto" w:frame="1"/>
+                <w:lang w:eastAsia="es-PE"/>
+              </w:rPr>
+              <w:t xml:space="preserve">Full HD (1920x1080 </w:t>
+            </w:r>
+            <w:proofErr w:type="spellStart"/>
+            <w:r>
+              <w:rPr>
+                <w:rFonts w:ascii="Times New Roman" w:eastAsia="Times New Roman" w:hAnsi="Times New Roman" w:cs="Times New Roman"/>
+                <w:color w:val="1F1F1F"/>
+                <w:bdr w:val="none" w:sz="0" w:space="0" w:color="auto" w:frame="1"/>
+                <w:lang w:eastAsia="es-PE"/>
+              </w:rPr>
+              <w:t>px</w:t>
+            </w:r>
+            <w:proofErr w:type="spellEnd"/>
+            <w:r>
+              <w:rPr>
+                <w:rFonts w:ascii="Times New Roman" w:eastAsia="Times New Roman" w:hAnsi="Times New Roman" w:cs="Times New Roman"/>
+                <w:color w:val="1F1F1F"/>
+                <w:bdr w:val="none" w:sz="0" w:space="0" w:color="auto" w:frame="1"/>
+                <w:lang w:eastAsia="es-PE"/>
+              </w:rPr>
+              <w:t>)</w:t>
+            </w:r>
+          </w:p>
+        </w:tc>
+      </w:tr>
+      <w:tr>
+        <w:trPr>
+          <w:tblCellSpacing w:w="15" w:type="dxa"/>
+        </w:trPr>
+        <w:tc>
+          <w:tcPr>
+            <w:tcW w:w="0" w:type="auto"/>
+            <w:tcBorders>
+              <w:top w:val="single" w:sz="6" w:space="0" w:color="auto"/>
+              <w:left w:val="single" w:sz="6" w:space="0" w:color="auto"/>
+              <w:bottom w:val="single" w:sz="6" w:space="0" w:color="auto"/>
+              <w:right w:val="single" w:sz="6" w:space="0" w:color="auto"/>
+            </w:tcBorders>
+            <w:tcMar>
+              <w:top w:w="120" w:type="dxa"/>
+              <w:left w:w="180" w:type="dxa"/>
+              <w:bottom w:w="120" w:type="dxa"/>
+              <w:right w:w="180" w:type="dxa"/>
+            </w:tcMar>
+            <w:vAlign w:val="center"/>
+            <w:hideMark/>
+          </w:tcPr>
+          <w:p>
+            <w:pPr>
+              <w:spacing w:after="0" w:line="240" w:lineRule="auto"/>
+              <w:jc w:val="left"/>
+              <w:rPr>
+                <w:rFonts w:ascii="Times New Roman" w:eastAsia="Times New Roman" w:hAnsi="Times New Roman" w:cs="Times New Roman"/>
+                <w:color w:val="1F1F1F"/>
+                <w:lang w:eastAsia="es-PE"/>
+              </w:rPr>
+            </w:pPr>
+            <w:r>
+              <w:rPr>
+                <w:rFonts w:ascii="Times New Roman" w:eastAsia="Times New Roman" w:hAnsi="Times New Roman" w:cs="Times New Roman"/>
+                <w:b/>
+                <w:bCs/>
+                <w:color w:val="1F1F1F"/>
+                <w:bdr w:val="none" w:sz="0" w:space="0" w:color="auto" w:frame="1"/>
+                <w:lang w:eastAsia="es-PE"/>
+              </w:rPr>
+              <w:t>Periféricos</w:t>
+            </w:r>
+          </w:p>
+        </w:tc>
+        <w:tc>
+          <w:tcPr>
+            <w:tcW w:w="0" w:type="auto"/>
+            <w:tcBorders>
+              <w:top w:val="single" w:sz="6" w:space="0" w:color="auto"/>
+              <w:left w:val="single" w:sz="6" w:space="0" w:color="auto"/>
+              <w:bottom w:val="single" w:sz="6" w:space="0" w:color="auto"/>
+              <w:right w:val="single" w:sz="6" w:space="0" w:color="auto"/>
+            </w:tcBorders>
+            <w:tcMar>
+              <w:top w:w="120" w:type="dxa"/>
+              <w:left w:w="180" w:type="dxa"/>
+              <w:bottom w:w="120" w:type="dxa"/>
+              <w:right w:w="180" w:type="dxa"/>
+            </w:tcMar>
+            <w:vAlign w:val="center"/>
+            <w:hideMark/>
+          </w:tcPr>
+          <w:p>
+            <w:pPr>
+              <w:spacing w:after="0" w:line="240" w:lineRule="auto"/>
+              <w:jc w:val="left"/>
+              <w:rPr>
+                <w:rFonts w:ascii="Times New Roman" w:eastAsia="Times New Roman" w:hAnsi="Times New Roman" w:cs="Times New Roman"/>
+                <w:color w:val="1F1F1F"/>
+                <w:lang w:eastAsia="es-PE"/>
+              </w:rPr>
+            </w:pPr>
+            <w:r>
+              <w:rPr>
+                <w:rFonts w:ascii="Times New Roman" w:eastAsia="Times New Roman" w:hAnsi="Times New Roman" w:cs="Times New Roman"/>
+                <w:color w:val="1F1F1F"/>
+                <w:bdr w:val="none" w:sz="0" w:space="0" w:color="auto" w:frame="1"/>
+                <w:lang w:eastAsia="es-PE"/>
+              </w:rPr>
+              <w:t>Teclado, mouse y acceso a red local</w:t>
+            </w:r>
+          </w:p>
+        </w:tc>
+        <w:tc>
+          <w:tcPr>
+            <w:tcW w:w="0" w:type="auto"/>
+            <w:tcBorders>
+              <w:top w:val="single" w:sz="6" w:space="0" w:color="auto"/>
+              <w:left w:val="single" w:sz="6" w:space="0" w:color="auto"/>
+              <w:bottom w:val="single" w:sz="6" w:space="0" w:color="auto"/>
+              <w:right w:val="single" w:sz="6" w:space="0" w:color="auto"/>
+            </w:tcBorders>
+            <w:tcMar>
+              <w:top w:w="120" w:type="dxa"/>
+              <w:left w:w="180" w:type="dxa"/>
+              <w:bottom w:w="120" w:type="dxa"/>
+              <w:right w:w="180" w:type="dxa"/>
+            </w:tcMar>
+            <w:vAlign w:val="center"/>
+            <w:hideMark/>
+          </w:tcPr>
+          <w:p>
+            <w:pPr>
+              <w:spacing w:after="0" w:line="240" w:lineRule="auto"/>
+              <w:jc w:val="left"/>
+              <w:rPr>
+                <w:rFonts w:ascii="Times New Roman" w:eastAsia="Times New Roman" w:hAnsi="Times New Roman" w:cs="Times New Roman"/>
+                <w:color w:val="1F1F1F"/>
+                <w:lang w:eastAsia="es-PE"/>
+              </w:rPr>
+            </w:pPr>
+            <w:r>
+              <w:rPr>
+                <w:rFonts w:ascii="Times New Roman" w:eastAsia="Times New Roman" w:hAnsi="Times New Roman" w:cs="Times New Roman"/>
+                <w:color w:val="1F1F1F"/>
+                <w:bdr w:val="none" w:sz="0" w:space="0" w:color="auto" w:frame="1"/>
+                <w:lang w:eastAsia="es-PE"/>
+              </w:rPr>
+              <w:t xml:space="preserve">Igual o superior, con acceso LAN o </w:t>
+            </w:r>
+            <w:proofErr w:type="spellStart"/>
+            <w:r>
+              <w:rPr>
+                <w:rFonts w:ascii="Times New Roman" w:eastAsia="Times New Roman" w:hAnsi="Times New Roman" w:cs="Times New Roman"/>
+                <w:color w:val="1F1F1F"/>
+                <w:bdr w:val="none" w:sz="0" w:space="0" w:color="auto" w:frame="1"/>
+                <w:lang w:eastAsia="es-PE"/>
+              </w:rPr>
+              <w:t>Wi</w:t>
+            </w:r>
+            <w:proofErr w:type="spellEnd"/>
+            <w:r>
+              <w:rPr>
+                <w:rFonts w:ascii="Times New Roman" w:eastAsia="Times New Roman" w:hAnsi="Times New Roman" w:cs="Times New Roman"/>
+                <w:color w:val="1F1F1F"/>
+                <w:bdr w:val="none" w:sz="0" w:space="0" w:color="auto" w:frame="1"/>
+                <w:lang w:eastAsia="es-PE"/>
+              </w:rPr>
+              <w:t>-Fi estable</w:t>
+            </w:r>
+          </w:p>
+        </w:tc>
+      </w:tr>
+    </w:tbl>
+    <w:p>
+      <w:pPr>
         <w:rPr>
           <w:b/>
           <w:bCs/>
           <w:lang w:eastAsia="es-PE"/>
         </w:rPr>
-        <w:lastRenderedPageBreak/>
-        <w:t>2.2 Requisitos de Hardware (mínimos)</w:t>
-      </w:r>
-    </w:p>
-    <w:p>
-      <w:pPr>
-        <w:rPr>
-          <w:b/>
-          <w:bCs/>
-          <w:lang w:eastAsia="es-PE"/>
-        </w:rPr>
-      </w:pPr>
-    </w:p>
-    <w:p>
-      <w:pPr>
-        <w:rPr>
-          <w:b/>
-          <w:bCs/>
-          <w:lang w:eastAsia="es-PE"/>
-        </w:rPr>
-      </w:pPr>
-      <w:r>
-        <w:rPr>
-          <w:b/>
-          <w:bCs/>
-          <w:lang w:eastAsia="es-PE"/>
-        </w:rPr>
-        <w:drawing>
-          <wp:inline distT="0" distB="0" distL="0" distR="0" wp14:anchorId="19606276" wp14:editId="3D04EC90">
-            <wp:extent cx="5400040" cy="2943225"/>
-            <wp:effectExtent l="0" t="0" r="0" b="9525"/>
-            <wp:docPr id="2" name="Imagen 2"/>
-            <wp:cNvGraphicFramePr>
-              <a:graphicFrameLocks xmlns:a="http://schemas.openxmlformats.org/drawingml/2006/main" noChangeAspect="1"/>
-            </wp:cNvGraphicFramePr>
-            <a:graphic xmlns:a="http://schemas.openxmlformats.org/drawingml/2006/main">
-              <a:graphicData uri="http://schemas.openxmlformats.org/drawingml/2006/picture">
-                <pic:pic xmlns:pic="http://schemas.openxmlformats.org/drawingml/2006/picture">
-                  <pic:nvPicPr>
-                    <pic:cNvPr id="1" name=""/>
-                    <pic:cNvPicPr/>
-                  </pic:nvPicPr>
-                  <pic:blipFill>
-                    <a:blip r:embed="rId6"/>
-                    <a:stretch>
-                      <a:fillRect/>
-                    </a:stretch>
-                  </pic:blipFill>
-                  <pic:spPr>
-                    <a:xfrm>
-                      <a:off x="0" y="0"/>
-                      <a:ext cx="5400040" cy="2943225"/>
-                    </a:xfrm>
-                    <a:prstGeom prst="rect">
-                      <a:avLst/>
-                    </a:prstGeom>
-                  </pic:spPr>
-                </pic:pic>
-              </a:graphicData>
-            </a:graphic>
-          </wp:inline>
-        </w:drawing>
-      </w:r>
+      </w:pPr>
     </w:p>
     <w:p>
       <w:pPr>
@@ -478,9 +2142,18 @@
           <w:szCs w:val="20"/>
           <w:lang w:val="en-US" w:eastAsia="es-PE"/>
         </w:rPr>
-        <w:t xml:space="preserve">git </w:t>
-      </w:r>
-      <w:hyperlink r:id="rId7" w:history="1">
+        <w:t>git clone</w:t>
+      </w:r>
+      <w:r>
+        <w:rPr>
+          <w:rFonts w:ascii="Consolas" w:hAnsi="Consolas"/>
+          <w:sz w:val="20"/>
+          <w:szCs w:val="20"/>
+          <w:lang w:val="en-US" w:eastAsia="es-PE"/>
+        </w:rPr>
+        <w:t xml:space="preserve"> </w:t>
+      </w:r>
+      <w:hyperlink r:id="rId5" w:history="1">
         <w:r>
           <w:rPr>
             <w:rStyle w:val="Hipervnculo"/>
@@ -532,6 +2205,7 @@
         </w:rPr>
         <w:t>tani</w:t>
       </w:r>
+      <w:proofErr w:type="spellEnd"/>
     </w:p>
     <w:p>
       <w:pPr>
@@ -544,7 +2218,14 @@
         <w:rPr>
           <w:lang w:val="en-US"/>
         </w:rPr>
-        <w:t>4.2 Configuración</w:t>
+        <w:t xml:space="preserve">4.2 </w:t>
+      </w:r>
+      <w:proofErr w:type="spellStart"/>
+      <w:r>
+        <w:rPr>
+          <w:lang w:val="en-US"/>
+        </w:rPr>
+        <w:t>Configuración</w:t>
       </w:r>
       <w:proofErr w:type="spellEnd"/>
       <w:r>
@@ -980,7 +2661,6 @@
           <w:szCs w:val="21"/>
           <w:lang w:eastAsia="es-PE"/>
         </w:rPr>
-        <w:lastRenderedPageBreak/>
         <w:t xml:space="preserve"># </w:t>
       </w:r>
       <w:proofErr w:type="spellStart"/>
@@ -1908,9 +3588,57 @@
     </w:p>
     <w:p>
       <w:pPr>
+        <w:pStyle w:val="Prrafodelista"/>
+      </w:pPr>
+      <w:r>
+        <w:t xml:space="preserve">Selecciona la base de datos </w:t>
+      </w:r>
+      <w:proofErr w:type="spellStart"/>
+      <w:r>
+        <w:rPr>
+          <w:rStyle w:val="CdigoHTML"/>
+          <w:rFonts w:eastAsiaTheme="minorHAnsi"/>
+        </w:rPr>
+        <w:t>bancodelechedb</w:t>
+      </w:r>
+      <w:proofErr w:type="spellEnd"/>
+      <w:r>
+        <w:t xml:space="preserve">, ve a la pestaña </w:t>
+      </w:r>
+      <w:r>
+        <w:rPr>
+          <w:b/>
+          <w:bCs/>
+        </w:rPr>
+        <w:t>"Importar"</w:t>
+      </w:r>
+      <w:r>
+        <w:t xml:space="preserve">, selecciona el archivo </w:t>
+      </w:r>
+      <w:proofErr w:type="spellStart"/>
+      <w:r>
+        <w:rPr>
+          <w:rStyle w:val="CdigoHTML"/>
+          <w:rFonts w:eastAsiaTheme="minorHAnsi"/>
+        </w:rPr>
+        <w:t>bancodelechedb.sql</w:t>
+      </w:r>
+      <w:proofErr w:type="spellEnd"/>
+      <w:r>
+        <w:t xml:space="preserve"> y pulsa "Continuar".</w:t>
+      </w:r>
+    </w:p>
+    <w:p>
+      <w:pPr>
+        <w:pStyle w:val="Prrafodelista"/>
+      </w:pPr>
+    </w:p>
+    <w:p>
+      <w:pPr>
+        <w:pStyle w:val="Prrafodelista"/>
         <w:numPr>
           <w:ilvl w:val="0"/>
-          <w:numId w:val="3"/>
+          <w:numId w:val="2"/>
         </w:numPr>
         <w:rPr>
           <w:lang w:eastAsia="es-PE"/>
@@ -2093,33 +3821,86 @@
     <w:p>
       <w:pPr>
         <w:rPr>
-          <w:lang w:eastAsia="es-PE"/>
-        </w:rPr>
-      </w:pPr>
-      <w:r>
-        <w:rPr>
-          <w:lang w:eastAsia="es-PE"/>
-        </w:rPr>
-        <w:t xml:space="preserve">Esto abrirá la aplicación en </w:t>
-      </w:r>
-      <w:r>
-        <w:rPr>
           <w:rFonts w:ascii="Consolas" w:hAnsi="Consolas"/>
           <w:sz w:val="20"/>
           <w:szCs w:val="20"/>
           <w:lang w:val="en-US" w:eastAsia="es-PE"/>
         </w:rPr>
-        <w:t>http://localhost:</w:t>
-      </w:r>
-      <w:r>
-        <w:rPr>
-          <w:rFonts w:ascii="Consolas" w:hAnsi="Consolas"/>
-          <w:sz w:val="20"/>
-          <w:szCs w:val="20"/>
-          <w:lang w:val="en-US" w:eastAsia="es-PE"/>
-        </w:rPr>
-        <w:t>4200</w:t>
-      </w:r>
+      </w:pPr>
+      <w:r>
+        <w:rPr>
+          <w:lang w:eastAsia="es-PE"/>
+        </w:rPr>
+        <w:t xml:space="preserve">Esto abrirá la aplicación en </w:t>
+      </w:r>
+      <w:hyperlink r:id="rId6" w:history="1">
+        <w:r>
+          <w:rPr>
+            <w:rStyle w:val="Hipervnculo"/>
+            <w:rFonts w:ascii="Consolas" w:hAnsi="Consolas"/>
+            <w:sz w:val="20"/>
+            <w:szCs w:val="20"/>
+            <w:lang w:val="en-US" w:eastAsia="es-PE"/>
+          </w:rPr>
+          <w:t>http://localhost:9090:AYNI</w:t>
+        </w:r>
+      </w:hyperlink>
+    </w:p>
+    <w:p>
+      <w:pPr>
+        <w:rPr>
+          <w:lang w:eastAsia="es-PE"/>
+        </w:rPr>
+      </w:pPr>
+    </w:p>
+    <w:p>
+      <w:pPr>
+        <w:rPr>
+          <w:lang w:eastAsia="es-PE"/>
+        </w:rPr>
+      </w:pPr>
+    </w:p>
+    <w:p>
+      <w:pPr>
+        <w:rPr>
+          <w:lang w:eastAsia="es-PE"/>
+        </w:rPr>
+      </w:pPr>
+    </w:p>
+    <w:p>
+      <w:pPr>
+        <w:rPr>
+          <w:lang w:eastAsia="es-PE"/>
+        </w:rPr>
+      </w:pPr>
+    </w:p>
+    <w:p>
+      <w:pPr>
+        <w:jc w:val="left"/>
+        <w:rPr>
+          <w:lang w:eastAsia="es-PE"/>
+        </w:rPr>
+      </w:pPr>
+      <w:r>
+        <w:rPr>
+          <w:lang w:eastAsia="es-PE"/>
+        </w:rPr>
+        <w:br w:type="page"/>
+      </w:r>
+    </w:p>
+    <w:p>
+      <w:pPr>
+        <w:rPr>
+          <w:lang w:eastAsia="es-PE"/>
+        </w:rPr>
+      </w:pPr>
+    </w:p>
+    <w:p>
+      <w:pPr>
+        <w:rPr>
+          <w:lang w:eastAsia="es-PE"/>
+        </w:rPr>
+      </w:pPr>
     </w:p>
     <w:p>
       <w:pPr>
@@ -2259,7 +4040,6 @@
     <w:p>
       <w:pPr>
         <w:spacing w:before="100" w:beforeAutospacing="1" w:after="100" w:afterAutospacing="1" w:line="240" w:lineRule="auto"/>
-        <w:ind w:left="708"/>
         <w:jc w:val="left"/>
         <w:rPr>
           <w:rFonts w:ascii="Times New Roman" w:eastAsia="Times New Roman" w:hAnsi="Times New Roman" w:cs="Times New Roman"/>
@@ -2269,21 +4049,9 @@
     </w:p>
     <w:p>
       <w:pPr>
-        <w:spacing w:before="100" w:beforeAutospacing="1" w:after="100" w:afterAutospacing="1" w:line="240" w:lineRule="auto"/>
-        <w:ind w:left="708"/>
-        <w:jc w:val="left"/>
-        <w:rPr>
-          <w:rFonts w:ascii="Times New Roman" w:eastAsia="Times New Roman" w:hAnsi="Times New Roman" w:cs="Times New Roman"/>
-          <w:lang w:eastAsia="es-PE"/>
-        </w:rPr>
-      </w:pPr>
-    </w:p>
-    <w:p>
-      <w:pPr>
         <w:pStyle w:val="Ttulo2"/>
       </w:pPr>
       <w:r>
-        <w:lastRenderedPageBreak/>
         <w:t xml:space="preserve">5.2 </w:t>
       </w:r>
       <w:proofErr w:type="spellStart"/>
@@ -2292,10 +4060,7 @@
       </w:r>
       <w:proofErr w:type="spellEnd"/>
       <w:r>
-        <w:t xml:space="preserve"> - </w:t>
-      </w:r>
-      <w:r>
-        <w:t xml:space="preserve">Angular (en Visual Studio </w:t>
+        <w:t xml:space="preserve"> - Angular (en Visual Studio </w:t>
       </w:r>
       <w:proofErr w:type="spellStart"/>
       <w:r>
@@ -2447,19 +4212,7 @@
         <w:t xml:space="preserve">Acceso mediante el URL: </w:t>
       </w:r>
       <w:r>
-        <w:t>http://localhost/banco</w:t>
-      </w:r>
-      <w:r>
-        <w:t>d</w:t>
-      </w:r>
-      <w:r>
-        <w:t>e</w:t>
-      </w:r>
-      <w:r>
-        <w:t>l</w:t>
-      </w:r>
-      <w:r>
-        <w:t>eche</w:t>
+        <w:t>http://localhost/bancodeleche</w:t>
       </w:r>
     </w:p>
     <w:p>
@@ -2468,6 +4221,54 @@
       </w:pPr>
       <w:r>
         <w:t>5.3 Base de Datos</w:t>
+      </w:r>
+    </w:p>
+    <w:p>
+      <w:pPr>
+        <w:spacing w:before="100" w:beforeAutospacing="1" w:after="100" w:afterAutospacing="1" w:line="240" w:lineRule="auto"/>
+        <w:ind w:left="1416" w:hanging="708"/>
+        <w:jc w:val="left"/>
+        <w:rPr>
+          <w:rFonts w:ascii="Times New Roman" w:eastAsia="Times New Roman" w:hAnsi="Times New Roman" w:cs="Times New Roman"/>
+          <w:lang w:eastAsia="es-PE"/>
+        </w:rPr>
+      </w:pPr>
+      <w:r>
+        <w:rPr>
+          <w:rFonts w:ascii="Times New Roman" w:eastAsia="Times New Roman" w:hAnsi="Symbol" w:cs="Times New Roman"/>
+          <w:lang w:eastAsia="es-PE"/>
+        </w:rPr>
+        <w:t></w:t>
+      </w:r>
+      <w:r>
+        <w:rPr>
+          <w:rFonts w:ascii="Times New Roman" w:eastAsia="Times New Roman" w:hAnsi="Times New Roman" w:cs="Times New Roman"/>
+          <w:lang w:eastAsia="es-PE"/>
+        </w:rPr>
+        <w:t xml:space="preserve"> </w:t>
+      </w:r>
+      <w:r>
+        <w:rPr>
+          <w:rFonts w:ascii="Times New Roman" w:eastAsia="Times New Roman" w:hAnsi="Times New Roman" w:cs="Times New Roman"/>
+          <w:b/>
+          <w:bCs/>
+          <w:lang w:eastAsia="es-PE"/>
+        </w:rPr>
+        <w:t>Usar MySQL de XAMPP</w:t>
+      </w:r>
+      <w:r>
+        <w:rPr>
+          <w:rFonts w:ascii="Times New Roman" w:eastAsia="Times New Roman" w:hAnsi="Times New Roman" w:cs="Times New Roman"/>
+          <w:lang w:eastAsia="es-PE"/>
+        </w:rPr>
+        <w:t xml:space="preserve"> </w:t>
+      </w:r>
+      <w:r>
+        <w:rPr>
+          <w:rFonts w:ascii="Times New Roman" w:eastAsia="Times New Roman" w:hAnsi="Times New Roman" w:cs="Times New Roman"/>
+          <w:lang w:eastAsia="es-PE"/>
+        </w:rPr>
+        <w:t>para gestionar la base de datos localmente.</w:t>
       </w:r>
     </w:p>
     <w:p>
@@ -2492,8 +4293,9 @@
           <w:rFonts w:ascii="Times New Roman" w:eastAsia="Times New Roman" w:hAnsi="Times New Roman" w:cs="Times New Roman"/>
           <w:lang w:eastAsia="es-PE"/>
         </w:rPr>
-        <w:t xml:space="preserve"> </w:t>
-      </w:r>
+        <w:t xml:space="preserve"> Puedes administrar la base de datos a través de </w:t>
+      </w:r>
+      <w:proofErr w:type="spellStart"/>
       <w:r>
         <w:rPr>
           <w:rFonts w:ascii="Times New Roman" w:eastAsia="Times New Roman" w:hAnsi="Times New Roman" w:cs="Times New Roman"/>
@@ -2501,21 +4303,31 @@
           <w:bCs/>
           <w:lang w:eastAsia="es-PE"/>
         </w:rPr>
-        <w:t>Usar MySQL de XAMPP</w:t>
-      </w:r>
-      <w:r>
-        <w:rPr>
-          <w:rFonts w:ascii="Times New Roman" w:eastAsia="Times New Roman" w:hAnsi="Times New Roman" w:cs="Times New Roman"/>
-          <w:lang w:eastAsia="es-PE"/>
-        </w:rPr>
-        <w:t xml:space="preserve"> </w:t>
-      </w:r>
-      <w:r>
-        <w:rPr>
-          <w:rFonts w:ascii="Times New Roman" w:eastAsia="Times New Roman" w:hAnsi="Times New Roman" w:cs="Times New Roman"/>
-          <w:lang w:eastAsia="es-PE"/>
-        </w:rPr>
-        <w:t>para gestionar la base de datos localmente.</w:t>
+        <w:t>phpMyAdmin</w:t>
+      </w:r>
+      <w:proofErr w:type="spellEnd"/>
+      <w:r>
+        <w:rPr>
+          <w:rFonts w:ascii="Times New Roman" w:eastAsia="Times New Roman" w:hAnsi="Times New Roman" w:cs="Times New Roman"/>
+          <w:lang w:eastAsia="es-PE"/>
+        </w:rPr>
+        <w:t xml:space="preserve"> en </w:t>
+      </w:r>
+      <w:r>
+        <w:rPr>
+          <w:rFonts w:ascii="Courier New" w:eastAsia="Times New Roman" w:hAnsi="Courier New" w:cs="Courier New"/>
+          <w:sz w:val="20"/>
+          <w:szCs w:val="20"/>
+          <w:lang w:eastAsia="es-PE"/>
+        </w:rPr>
+        <w:t>http://localhost/phpmyadmin/</w:t>
+      </w:r>
+      <w:r>
+        <w:rPr>
+          <w:rFonts w:ascii="Times New Roman" w:eastAsia="Times New Roman" w:hAnsi="Times New Roman" w:cs="Times New Roman"/>
+          <w:lang w:eastAsia="es-PE"/>
+        </w:rPr>
+        <w:t>.</w:t>
       </w:r>
     </w:p>
     <w:p>
@@ -2540,9 +4352,8 @@
           <w:rFonts w:ascii="Times New Roman" w:eastAsia="Times New Roman" w:hAnsi="Times New Roman" w:cs="Times New Roman"/>
           <w:lang w:eastAsia="es-PE"/>
         </w:rPr>
-        <w:t xml:space="preserve"> Puedes administrar la base de datos a través de </w:t>
-      </w:r>
-      <w:proofErr w:type="spellStart"/>
+        <w:t xml:space="preserve"> La configuración en </w:t>
+      </w:r>
       <w:r>
         <w:rPr>
           <w:rFonts w:ascii="Times New Roman" w:eastAsia="Times New Roman" w:hAnsi="Times New Roman" w:cs="Times New Roman"/>
@@ -2550,7 +4361,17 @@
           <w:bCs/>
           <w:lang w:eastAsia="es-PE"/>
         </w:rPr>
-        <w:t>phpMyAdmin</w:t>
+        <w:t xml:space="preserve">Spring </w:t>
+      </w:r>
+      <w:proofErr w:type="spellStart"/>
+      <w:r>
+        <w:rPr>
+          <w:rFonts w:ascii="Times New Roman" w:eastAsia="Times New Roman" w:hAnsi="Times New Roman" w:cs="Times New Roman"/>
+          <w:b/>
+          <w:bCs/>
+          <w:lang w:eastAsia="es-PE"/>
+        </w:rPr>
+        <w:t>Boot</w:t>
       </w:r>
       <w:proofErr w:type="spellEnd"/>
       <w:r>
@@ -2558,16 +4379,73 @@
           <w:rFonts w:ascii="Times New Roman" w:eastAsia="Times New Roman" w:hAnsi="Times New Roman" w:cs="Times New Roman"/>
           <w:lang w:eastAsia="es-PE"/>
         </w:rPr>
-        <w:t xml:space="preserve"> en </w:t>
-      </w:r>
-      <w:r>
-        <w:rPr>
-          <w:rFonts w:ascii="Courier New" w:eastAsia="Times New Roman" w:hAnsi="Courier New" w:cs="Courier New"/>
-          <w:sz w:val="20"/>
-          <w:szCs w:val="20"/>
-          <w:lang w:eastAsia="es-PE"/>
-        </w:rPr>
-        <w:t>http://localhost/phpmyadmin/</w:t>
+        <w:t xml:space="preserve"> y el </w:t>
+      </w:r>
+      <w:proofErr w:type="spellStart"/>
+      <w:r>
+        <w:rPr>
+          <w:rFonts w:ascii="Times New Roman" w:eastAsia="Times New Roman" w:hAnsi="Times New Roman" w:cs="Times New Roman"/>
+          <w:b/>
+          <w:bCs/>
+          <w:lang w:eastAsia="es-PE"/>
+        </w:rPr>
+        <w:t>frontend</w:t>
+      </w:r>
+      <w:proofErr w:type="spellEnd"/>
+      <w:r>
+        <w:rPr>
+          <w:rFonts w:ascii="Times New Roman" w:eastAsia="Times New Roman" w:hAnsi="Times New Roman" w:cs="Times New Roman"/>
+          <w:b/>
+          <w:bCs/>
+          <w:lang w:eastAsia="es-PE"/>
+        </w:rPr>
+        <w:t xml:space="preserve"> Angular</w:t>
+      </w:r>
+      <w:r>
+        <w:rPr>
+          <w:rFonts w:ascii="Times New Roman" w:eastAsia="Times New Roman" w:hAnsi="Times New Roman" w:cs="Times New Roman"/>
+          <w:lang w:eastAsia="es-PE"/>
+        </w:rPr>
+        <w:t xml:space="preserve"> deben estar a</w:t>
+      </w:r>
+      <w:r>
+        <w:rPr>
+          <w:rFonts w:ascii="Times New Roman" w:eastAsia="Times New Roman" w:hAnsi="Times New Roman" w:cs="Times New Roman"/>
+          <w:lang w:eastAsia="es-PE"/>
+        </w:rPr>
+        <w:t>d</w:t>
+      </w:r>
+      <w:r>
+        <w:rPr>
+          <w:rFonts w:ascii="Times New Roman" w:eastAsia="Times New Roman" w:hAnsi="Times New Roman" w:cs="Times New Roman"/>
+          <w:lang w:eastAsia="es-PE"/>
+        </w:rPr>
+        <w:t xml:space="preserve">aptadas a </w:t>
+      </w:r>
+      <w:r>
+        <w:rPr>
+          <w:rFonts w:ascii="Times New Roman" w:eastAsia="Times New Roman" w:hAnsi="Times New Roman" w:cs="Times New Roman"/>
+          <w:b/>
+          <w:bCs/>
+          <w:lang w:eastAsia="es-PE"/>
+        </w:rPr>
+        <w:t>localhost</w:t>
+      </w:r>
+      <w:r>
+        <w:rPr>
+          <w:rFonts w:ascii="Times New Roman" w:eastAsia="Times New Roman" w:hAnsi="Times New Roman" w:cs="Times New Roman"/>
+          <w:lang w:eastAsia="es-PE"/>
+        </w:rPr>
+        <w:t xml:space="preserve"> o la IP interna del servidor donde se está ejecutando </w:t>
+      </w:r>
+      <w:r>
+        <w:rPr>
+          <w:rFonts w:ascii="Times New Roman" w:eastAsia="Times New Roman" w:hAnsi="Times New Roman" w:cs="Times New Roman"/>
+          <w:b/>
+          <w:bCs/>
+          <w:lang w:eastAsia="es-PE"/>
+        </w:rPr>
+        <w:t>XAMPP</w:t>
       </w:r>
       <w:r>
         <w:rPr>
@@ -2575,6 +4453,22 @@
           <w:lang w:eastAsia="es-PE"/>
         </w:rPr>
         <w:t>.</w:t>
+      </w:r>
+    </w:p>
+    <w:p>
+      <w:pPr>
+        <w:jc w:val="left"/>
+        <w:rPr>
+          <w:rFonts w:ascii="Times New Roman" w:eastAsia="Times New Roman" w:hAnsi="Times New Roman" w:cs="Times New Roman"/>
+          <w:lang w:eastAsia="es-PE"/>
+        </w:rPr>
+      </w:pPr>
+      <w:r>
+        <w:rPr>
+          <w:rFonts w:ascii="Times New Roman" w:eastAsia="Times New Roman" w:hAnsi="Times New Roman" w:cs="Times New Roman"/>
+          <w:lang w:eastAsia="es-PE"/>
+        </w:rPr>
+        <w:br w:type="page"/>
       </w:r>
     </w:p>
     <w:p>
@@ -2587,122 +4481,6 @@
           <w:lang w:eastAsia="es-PE"/>
         </w:rPr>
       </w:pPr>
-      <w:r>
-        <w:rPr>
-          <w:rFonts w:ascii="Times New Roman" w:eastAsia="Times New Roman" w:hAnsi="Symbol" w:cs="Times New Roman"/>
-          <w:lang w:eastAsia="es-PE"/>
-        </w:rPr>
-        <w:t></w:t>
-      </w:r>
-      <w:r>
-        <w:rPr>
-          <w:rFonts w:ascii="Times New Roman" w:eastAsia="Times New Roman" w:hAnsi="Times New Roman" w:cs="Times New Roman"/>
-          <w:lang w:eastAsia="es-PE"/>
-        </w:rPr>
-        <w:t xml:space="preserve"> La configuración en </w:t>
-      </w:r>
-      <w:r>
-        <w:rPr>
-          <w:rFonts w:ascii="Times New Roman" w:eastAsia="Times New Roman" w:hAnsi="Times New Roman" w:cs="Times New Roman"/>
-          <w:b/>
-          <w:bCs/>
-          <w:lang w:eastAsia="es-PE"/>
-        </w:rPr>
-        <w:t xml:space="preserve">Spring </w:t>
-      </w:r>
-      <w:proofErr w:type="spellStart"/>
-      <w:r>
-        <w:rPr>
-          <w:rFonts w:ascii="Times New Roman" w:eastAsia="Times New Roman" w:hAnsi="Times New Roman" w:cs="Times New Roman"/>
-          <w:b/>
-          <w:bCs/>
-          <w:lang w:eastAsia="es-PE"/>
-        </w:rPr>
-        <w:t>Boot</w:t>
-      </w:r>
-      <w:proofErr w:type="spellEnd"/>
-      <w:r>
-        <w:rPr>
-          <w:rFonts w:ascii="Times New Roman" w:eastAsia="Times New Roman" w:hAnsi="Times New Roman" w:cs="Times New Roman"/>
-          <w:lang w:eastAsia="es-PE"/>
-        </w:rPr>
-        <w:t xml:space="preserve"> y el </w:t>
-      </w:r>
-      <w:proofErr w:type="spellStart"/>
-      <w:r>
-        <w:rPr>
-          <w:rFonts w:ascii="Times New Roman" w:eastAsia="Times New Roman" w:hAnsi="Times New Roman" w:cs="Times New Roman"/>
-          <w:b/>
-          <w:bCs/>
-          <w:lang w:eastAsia="es-PE"/>
-        </w:rPr>
-        <w:t>frontend</w:t>
-      </w:r>
-      <w:proofErr w:type="spellEnd"/>
-      <w:r>
-        <w:rPr>
-          <w:rFonts w:ascii="Times New Roman" w:eastAsia="Times New Roman" w:hAnsi="Times New Roman" w:cs="Times New Roman"/>
-          <w:b/>
-          <w:bCs/>
-          <w:lang w:eastAsia="es-PE"/>
-        </w:rPr>
-        <w:t xml:space="preserve"> Angular</w:t>
-      </w:r>
-      <w:r>
-        <w:rPr>
-          <w:rFonts w:ascii="Times New Roman" w:eastAsia="Times New Roman" w:hAnsi="Times New Roman" w:cs="Times New Roman"/>
-          <w:lang w:eastAsia="es-PE"/>
-        </w:rPr>
-        <w:t xml:space="preserve"> deben estar </w:t>
-      </w:r>
-      <w:proofErr w:type="spellStart"/>
-      <w:r>
-        <w:rPr>
-          <w:rFonts w:ascii="Times New Roman" w:eastAsia="Times New Roman" w:hAnsi="Times New Roman" w:cs="Times New Roman"/>
-          <w:lang w:eastAsia="es-PE"/>
-        </w:rPr>
-        <w:t>aaptadas</w:t>
-      </w:r>
-      <w:proofErr w:type="spellEnd"/>
-      <w:r>
-        <w:rPr>
-          <w:rFonts w:ascii="Times New Roman" w:eastAsia="Times New Roman" w:hAnsi="Times New Roman" w:cs="Times New Roman"/>
-          <w:lang w:eastAsia="es-PE"/>
-        </w:rPr>
-        <w:t xml:space="preserve"> a </w:t>
-      </w:r>
-      <w:r>
-        <w:rPr>
-          <w:rFonts w:ascii="Times New Roman" w:eastAsia="Times New Roman" w:hAnsi="Times New Roman" w:cs="Times New Roman"/>
-          <w:b/>
-          <w:bCs/>
-          <w:lang w:eastAsia="es-PE"/>
-        </w:rPr>
-        <w:t>localhost</w:t>
-      </w:r>
-      <w:r>
-        <w:rPr>
-          <w:rFonts w:ascii="Times New Roman" w:eastAsia="Times New Roman" w:hAnsi="Times New Roman" w:cs="Times New Roman"/>
-          <w:lang w:eastAsia="es-PE"/>
-        </w:rPr>
-        <w:t xml:space="preserve"> o la IP interna del servidor donde se está ejecutando </w:t>
-      </w:r>
-      <w:r>
-        <w:rPr>
-          <w:rFonts w:ascii="Times New Roman" w:eastAsia="Times New Roman" w:hAnsi="Times New Roman" w:cs="Times New Roman"/>
-          <w:b/>
-          <w:bCs/>
-          <w:lang w:eastAsia="es-PE"/>
-        </w:rPr>
-        <w:t>XAMPP</w:t>
-      </w:r>
-      <w:r>
-        <w:rPr>
-          <w:rFonts w:ascii="Times New Roman" w:eastAsia="Times New Roman" w:hAnsi="Times New Roman" w:cs="Times New Roman"/>
-          <w:lang w:eastAsia="es-PE"/>
-        </w:rPr>
-        <w:t>.</w:t>
-      </w:r>
     </w:p>
     <w:p>
       <w:pPr>
@@ -2803,151 +4581,6 @@
     </w:p>
     <w:p>
       <w:pPr>
-        <w:pStyle w:val="Prrafodelista"/>
-        <w:numPr>
-          <w:ilvl w:val="0"/>
-          <w:numId w:val="4"/>
-        </w:numPr>
-        <w:rPr>
-          <w:lang w:eastAsia="es-PE"/>
-        </w:rPr>
-      </w:pPr>
-      <w:r>
-        <w:rPr>
-          <w:lang w:eastAsia="es-PE"/>
-        </w:rPr>
-        <w:t xml:space="preserve">Usa herramientas como </w:t>
-      </w:r>
-      <w:r>
-        <w:rPr>
-          <w:b/>
-          <w:bCs/>
-          <w:lang w:eastAsia="es-PE"/>
-        </w:rPr>
-        <w:t>Winston</w:t>
-      </w:r>
-      <w:r>
-        <w:rPr>
-          <w:lang w:eastAsia="es-PE"/>
-        </w:rPr>
-        <w:t xml:space="preserve"> o </w:t>
-      </w:r>
-      <w:r>
-        <w:rPr>
-          <w:b/>
-          <w:bCs/>
-          <w:lang w:eastAsia="es-PE"/>
-        </w:rPr>
-        <w:t>Morgan</w:t>
-      </w:r>
-      <w:r>
-        <w:rPr>
-          <w:lang w:eastAsia="es-PE"/>
-        </w:rPr>
-        <w:t xml:space="preserve"> para </w:t>
-      </w:r>
-      <w:proofErr w:type="spellStart"/>
-      <w:r>
-        <w:rPr>
-          <w:lang w:eastAsia="es-PE"/>
-        </w:rPr>
-        <w:t>logging</w:t>
-      </w:r>
-      <w:proofErr w:type="spellEnd"/>
-      <w:r>
-        <w:rPr>
-          <w:lang w:eastAsia="es-PE"/>
-        </w:rPr>
-        <w:t xml:space="preserve"> del </w:t>
-      </w:r>
-      <w:proofErr w:type="spellStart"/>
-      <w:r>
-        <w:rPr>
-          <w:lang w:eastAsia="es-PE"/>
-        </w:rPr>
-        <w:t>backend</w:t>
-      </w:r>
-      <w:proofErr w:type="spellEnd"/>
-      <w:r>
-        <w:rPr>
-          <w:lang w:eastAsia="es-PE"/>
-        </w:rPr>
-        <w:t>.</w:t>
-      </w:r>
-    </w:p>
-    <w:p>
-      <w:pPr>
-        <w:pStyle w:val="Prrafodelista"/>
-        <w:numPr>
-          <w:ilvl w:val="0"/>
-          <w:numId w:val="4"/>
-        </w:numPr>
-        <w:rPr>
-          <w:lang w:eastAsia="es-PE"/>
-        </w:rPr>
-      </w:pPr>
-      <w:r>
-        <w:rPr>
-          <w:lang w:eastAsia="es-PE"/>
-        </w:rPr>
-        <w:t xml:space="preserve">Para monitoreo en producción, considera usar </w:t>
-      </w:r>
-      <w:proofErr w:type="spellStart"/>
-      <w:r>
-        <w:rPr>
-          <w:b/>
-          <w:bCs/>
-          <w:lang w:eastAsia="es-PE"/>
-        </w:rPr>
-        <w:t>Sentry</w:t>
-      </w:r>
-      <w:proofErr w:type="spellEnd"/>
-      <w:r>
-        <w:rPr>
-          <w:lang w:eastAsia="es-PE"/>
-        </w:rPr>
-        <w:t xml:space="preserve"> o </w:t>
-      </w:r>
-      <w:proofErr w:type="spellStart"/>
-      <w:r>
-        <w:rPr>
-          <w:b/>
-          <w:bCs/>
-          <w:lang w:eastAsia="es-PE"/>
-        </w:rPr>
-        <w:t>LogRocket</w:t>
-      </w:r>
-      <w:proofErr w:type="spellEnd"/>
-      <w:r>
-        <w:rPr>
-          <w:lang w:eastAsia="es-PE"/>
-        </w:rPr>
-        <w:t>.</w:t>
-      </w:r>
-    </w:p>
-    <w:p>
-      <w:pPr>
-        <w:pStyle w:val="Ttulo1"/>
-      </w:pPr>
-      <w:r>
-        <w:t>7. Verificación de Instalación</w:t>
-      </w:r>
-    </w:p>
-    <w:p>
-      <w:pPr>
-        <w:rPr>
-          <w:lang w:eastAsia="es-PE"/>
-        </w:rPr>
-      </w:pPr>
-      <w:r>
-        <w:rPr>
-          <w:lang w:eastAsia="es-PE"/>
-        </w:rPr>
-        <w:t>Verifica que:</w:t>
-      </w:r>
-    </w:p>
-    <w:p>
-      <w:pPr>
         <w:spacing w:before="100" w:beforeAutospacing="1" w:after="100" w:afterAutospacing="1" w:line="240" w:lineRule="auto"/>
         <w:ind w:left="708"/>
         <w:jc w:val="left"/>
@@ -2968,39 +4601,48 @@
           <w:rFonts w:ascii="Times New Roman" w:eastAsia="Times New Roman" w:hAnsi="Times New Roman" w:cs="Times New Roman"/>
           <w:lang w:eastAsia="es-PE"/>
         </w:rPr>
-        <w:t xml:space="preserve"> Puedes </w:t>
-      </w:r>
-      <w:r>
-        <w:rPr>
-          <w:rFonts w:ascii="Times New Roman" w:eastAsia="Times New Roman" w:hAnsi="Times New Roman" w:cs="Times New Roman"/>
-          <w:b/>
+        <w:t xml:space="preserve"> Implementa el sistema de </w:t>
+      </w:r>
+      <w:proofErr w:type="spellStart"/>
+      <w:r>
+        <w:rPr>
+          <w:rFonts w:ascii="Times New Roman" w:eastAsia="Times New Roman" w:hAnsi="Times New Roman" w:cs="Times New Roman"/>
           <w:bCs/>
           <w:lang w:eastAsia="es-PE"/>
         </w:rPr>
-        <w:t>registrarte</w:t>
-      </w:r>
-      <w:r>
-        <w:rPr>
-          <w:rFonts w:ascii="Times New Roman" w:eastAsia="Times New Roman" w:hAnsi="Times New Roman" w:cs="Times New Roman"/>
-          <w:lang w:eastAsia="es-PE"/>
-        </w:rPr>
-        <w:t xml:space="preserve"> e </w:t>
-      </w:r>
-      <w:r>
-        <w:rPr>
-          <w:rFonts w:ascii="Times New Roman" w:eastAsia="Times New Roman" w:hAnsi="Times New Roman" w:cs="Times New Roman"/>
-          <w:b/>
+        <w:t>Logging</w:t>
+      </w:r>
+      <w:proofErr w:type="spellEnd"/>
+      <w:r>
+        <w:rPr>
+          <w:rFonts w:ascii="Times New Roman" w:eastAsia="Times New Roman" w:hAnsi="Times New Roman" w:cs="Times New Roman"/>
           <w:bCs/>
           <w:lang w:eastAsia="es-PE"/>
         </w:rPr>
-        <w:t>iniciar sesión</w:t>
-      </w:r>
-      <w:r>
-        <w:rPr>
-          <w:rFonts w:ascii="Times New Roman" w:eastAsia="Times New Roman" w:hAnsi="Times New Roman" w:cs="Times New Roman"/>
-          <w:lang w:eastAsia="es-PE"/>
-        </w:rPr>
-        <w:t xml:space="preserve"> correctamente en el sistema.</w:t>
+        <w:t xml:space="preserve"> estándar de Java</w:t>
+      </w:r>
+      <w:r>
+        <w:rPr>
+          <w:rFonts w:ascii="Times New Roman" w:eastAsia="Times New Roman" w:hAnsi="Times New Roman" w:cs="Times New Roman"/>
+          <w:lang w:eastAsia="es-PE"/>
+        </w:rPr>
+        <w:t xml:space="preserve"> para el registro de eventos del </w:t>
+      </w:r>
+      <w:proofErr w:type="spellStart"/>
+      <w:r>
+        <w:rPr>
+          <w:rFonts w:ascii="Times New Roman" w:eastAsia="Times New Roman" w:hAnsi="Times New Roman" w:cs="Times New Roman"/>
+          <w:lang w:eastAsia="es-PE"/>
+        </w:rPr>
+        <w:t>backend</w:t>
+      </w:r>
+      <w:proofErr w:type="spellEnd"/>
+      <w:r>
+        <w:rPr>
+          <w:rFonts w:ascii="Times New Roman" w:eastAsia="Times New Roman" w:hAnsi="Times New Roman" w:cs="Times New Roman"/>
+          <w:lang w:eastAsia="es-PE"/>
+        </w:rPr>
+        <w:t>.</w:t>
       </w:r>
     </w:p>
     <w:p>
@@ -3025,23 +4667,53 @@
           <w:rFonts w:ascii="Times New Roman" w:eastAsia="Times New Roman" w:hAnsi="Times New Roman" w:cs="Times New Roman"/>
           <w:lang w:eastAsia="es-PE"/>
         </w:rPr>
-        <w:t xml:space="preserve"> Los </w:t>
-      </w:r>
-      <w:r>
-        <w:rPr>
-          <w:rFonts w:ascii="Times New Roman" w:eastAsia="Times New Roman" w:hAnsi="Times New Roman" w:cs="Times New Roman"/>
-          <w:b/>
+        <w:t xml:space="preserve"> Para el monitoreo en producción, se utilizan los </w:t>
+      </w:r>
+      <w:proofErr w:type="spellStart"/>
+      <w:r>
+        <w:rPr>
+          <w:rFonts w:ascii="Times New Roman" w:eastAsia="Times New Roman" w:hAnsi="Times New Roman" w:cs="Times New Roman"/>
           <w:bCs/>
           <w:lang w:eastAsia="es-PE"/>
         </w:rPr>
-        <w:t>tokens JWT</w:t>
-      </w:r>
-      <w:r>
-        <w:rPr>
-          <w:rFonts w:ascii="Times New Roman" w:eastAsia="Times New Roman" w:hAnsi="Times New Roman" w:cs="Times New Roman"/>
-          <w:lang w:eastAsia="es-PE"/>
-        </w:rPr>
-        <w:t xml:space="preserve"> funcionan correctamente para la autenticación y autorización.</w:t>
+        <w:t>endpoints</w:t>
+      </w:r>
+      <w:proofErr w:type="spellEnd"/>
+      <w:r>
+        <w:rPr>
+          <w:rFonts w:ascii="Times New Roman" w:eastAsia="Times New Roman" w:hAnsi="Times New Roman" w:cs="Times New Roman"/>
+          <w:bCs/>
+          <w:lang w:eastAsia="es-PE"/>
+        </w:rPr>
+        <w:t xml:space="preserve"> de salud y métricas</w:t>
+      </w:r>
+      <w:r>
+        <w:rPr>
+          <w:rFonts w:ascii="Times New Roman" w:eastAsia="Times New Roman" w:hAnsi="Times New Roman" w:cs="Times New Roman"/>
+          <w:lang w:eastAsia="es-PE"/>
+        </w:rPr>
+        <w:t xml:space="preserve"> del servidor de aplicaciones.</w:t>
+      </w:r>
+    </w:p>
+    <w:p>
+      <w:pPr>
+        <w:pStyle w:val="Ttulo1"/>
+      </w:pPr>
+      <w:r>
+        <w:t>7. Verificación de Instalación</w:t>
+      </w:r>
+    </w:p>
+    <w:p>
+      <w:pPr>
+        <w:rPr>
+          <w:lang w:eastAsia="es-PE"/>
+        </w:rPr>
+      </w:pPr>
+      <w:r>
+        <w:rPr>
+          <w:lang w:eastAsia="es-PE"/>
+        </w:rPr>
+        <w:t>Verifica que:</w:t>
       </w:r>
     </w:p>
     <w:p>
@@ -3066,12 +4738,105 @@
           <w:rFonts w:ascii="Times New Roman" w:eastAsia="Times New Roman" w:hAnsi="Times New Roman" w:cs="Times New Roman"/>
           <w:lang w:eastAsia="es-PE"/>
         </w:rPr>
+        <w:t xml:space="preserve"> Puedes </w:t>
+      </w:r>
+      <w:r>
+        <w:rPr>
+          <w:rFonts w:ascii="Times New Roman" w:eastAsia="Times New Roman" w:hAnsi="Times New Roman" w:cs="Times New Roman"/>
+          <w:bCs/>
+          <w:lang w:eastAsia="es-PE"/>
+        </w:rPr>
+        <w:t>registrarte</w:t>
+      </w:r>
+      <w:r>
+        <w:rPr>
+          <w:rFonts w:ascii="Times New Roman" w:eastAsia="Times New Roman" w:hAnsi="Times New Roman" w:cs="Times New Roman"/>
+          <w:lang w:eastAsia="es-PE"/>
+        </w:rPr>
+        <w:t xml:space="preserve"> e </w:t>
+      </w:r>
+      <w:r>
+        <w:rPr>
+          <w:rFonts w:ascii="Times New Roman" w:eastAsia="Times New Roman" w:hAnsi="Times New Roman" w:cs="Times New Roman"/>
+          <w:bCs/>
+          <w:lang w:eastAsia="es-PE"/>
+        </w:rPr>
+        <w:t>iniciar sesión</w:t>
+      </w:r>
+      <w:r>
+        <w:rPr>
+          <w:rFonts w:ascii="Times New Roman" w:eastAsia="Times New Roman" w:hAnsi="Times New Roman" w:cs="Times New Roman"/>
+          <w:lang w:eastAsia="es-PE"/>
+        </w:rPr>
+        <w:t xml:space="preserve"> correctamente en el sistema.</w:t>
+      </w:r>
+    </w:p>
+    <w:p>
+      <w:pPr>
+        <w:spacing w:before="100" w:beforeAutospacing="1" w:after="100" w:afterAutospacing="1" w:line="240" w:lineRule="auto"/>
+        <w:ind w:left="708"/>
+        <w:jc w:val="left"/>
+      </w:pPr>
+      <w:r>
+        <w:rPr>
+          <w:rFonts w:ascii="Times New Roman" w:eastAsia="Times New Roman" w:hAnsi="Symbol" w:cs="Times New Roman"/>
+          <w:lang w:eastAsia="es-PE"/>
+        </w:rPr>
+        <w:t></w:t>
+      </w:r>
+      <w:r>
+        <w:rPr>
+          <w:rFonts w:ascii="Times New Roman" w:eastAsia="Times New Roman" w:hAnsi="Times New Roman" w:cs="Times New Roman"/>
+          <w:lang w:eastAsia="es-PE"/>
+        </w:rPr>
+        <w:t xml:space="preserve"> </w:t>
+      </w:r>
+      <w:r>
+        <w:t>El sistema cuent</w:t>
+      </w:r>
+      <w:r>
+        <w:t>e</w:t>
+      </w:r>
+      <w:r>
+        <w:t xml:space="preserve"> con un módulo de </w:t>
+      </w:r>
+      <w:r>
+        <w:rPr>
+          <w:bCs/>
+        </w:rPr>
+        <w:t>validación de credenciales y gestión de roles</w:t>
+      </w:r>
+      <w:r>
+        <w:t xml:space="preserve"> para el control de acceso.</w:t>
+      </w:r>
+    </w:p>
+    <w:p>
+      <w:pPr>
+        <w:spacing w:before="100" w:beforeAutospacing="1" w:after="100" w:afterAutospacing="1" w:line="240" w:lineRule="auto"/>
+        <w:ind w:left="708"/>
+        <w:jc w:val="left"/>
+        <w:rPr>
+          <w:rFonts w:ascii="Times New Roman" w:eastAsia="Times New Roman" w:hAnsi="Times New Roman" w:cs="Times New Roman"/>
+          <w:lang w:eastAsia="es-PE"/>
+        </w:rPr>
+      </w:pPr>
+      <w:r>
+        <w:rPr>
+          <w:rFonts w:ascii="Times New Roman" w:eastAsia="Times New Roman" w:hAnsi="Symbol" w:cs="Times New Roman"/>
+          <w:lang w:eastAsia="es-PE"/>
+        </w:rPr>
+        <w:t></w:t>
+      </w:r>
+      <w:r>
+        <w:rPr>
+          <w:rFonts w:ascii="Times New Roman" w:eastAsia="Times New Roman" w:hAnsi="Times New Roman" w:cs="Times New Roman"/>
+          <w:lang w:eastAsia="es-PE"/>
+        </w:rPr>
         <w:t xml:space="preserve"> Los datos se </w:t>
       </w:r>
       <w:r>
         <w:rPr>
           <w:rFonts w:ascii="Times New Roman" w:eastAsia="Times New Roman" w:hAnsi="Times New Roman" w:cs="Times New Roman"/>
-          <w:b/>
           <w:bCs/>
           <w:lang w:eastAsia="es-PE"/>
         </w:rPr>
@@ -3089,73 +4854,32 @@
       <w:pPr>
         <w:pStyle w:val="Ttulo1"/>
       </w:pPr>
+      <w:r>
+        <w:t>8. Contacto Técnico</w:t>
+      </w:r>
+    </w:p>
+    <w:p>
+      <w:pPr>
+        <w:rPr>
+          <w:lang w:eastAsia="es-PE"/>
+        </w:rPr>
+      </w:pPr>
+      <w:r>
+        <w:t xml:space="preserve">Para soporte técnico, puedes contactar a </w:t>
+      </w:r>
+      <w:r>
+        <w:rPr>
+          <w:rStyle w:val="Textoennegrita"/>
+        </w:rPr>
+        <w:t>SoporteBancoDeLeche@gmail.com</w:t>
+      </w:r>
     </w:p>
     <w:p>
       <w:pPr>
         <w:pStyle w:val="Ttulo1"/>
       </w:pPr>
       <w:r>
-        <w:lastRenderedPageBreak/>
-        <w:t>8. Contacto Técnico</w:t>
-      </w:r>
-    </w:p>
-    <w:p>
-      <w:pPr>
-        <w:rPr>
-          <w:lang w:eastAsia="es-PE"/>
-        </w:rPr>
-      </w:pPr>
-      <w:r>
-        <w:t xml:space="preserve">Para soporte técnico, puedes contactar a </w:t>
-      </w:r>
-      <w:r>
-        <w:rPr>
-          <w:rStyle w:val="Textoennegrita"/>
-        </w:rPr>
-        <w:t>S</w:t>
-      </w:r>
-      <w:r>
-        <w:rPr>
-          <w:rStyle w:val="Textoennegrita"/>
-        </w:rPr>
-        <w:t>oporte</w:t>
-      </w:r>
-      <w:r>
-        <w:rPr>
-          <w:rStyle w:val="Textoennegrita"/>
-        </w:rPr>
-        <w:t>BancoDeLeche</w:t>
-      </w:r>
-      <w:r>
-        <w:rPr>
-          <w:rStyle w:val="Textoennegrita"/>
-        </w:rPr>
-        <w:t>@</w:t>
-      </w:r>
-      <w:r>
-        <w:rPr>
-          <w:rStyle w:val="Textoennegrita"/>
-        </w:rPr>
-        <w:t>gmail</w:t>
-      </w:r>
-      <w:r>
-        <w:rPr>
-          <w:rStyle w:val="Textoennegrita"/>
-        </w:rPr>
-        <w:t>.com</w:t>
-      </w:r>
-    </w:p>
-    <w:p>
-      <w:pPr>
-        <w:pStyle w:val="Ttulo1"/>
-      </w:pPr>
-      <w:proofErr w:type="spellStart"/>
-      <w:r>
-        <w:t>9.</w:t>
-      </w:r>
-      <w:proofErr w:type="spellEnd"/>
-      <w:r>
-        <w:t xml:space="preserve"> Anexos</w:t>
+        <w:t>9. Anexos</w:t>
       </w:r>
     </w:p>
     <w:p>
@@ -3163,25 +4887,43 @@
         <w:tabs>
           <w:tab w:val="left" w:pos="7321"/>
         </w:tabs>
-        <w:rPr>
-          <w:lang w:eastAsia="es-PE"/>
-        </w:rPr>
-      </w:pPr>
-      <w:hyperlink r:id="rId8" w:history="1">
+      </w:pPr>
+      <w:r>
+        <w:t>Instalación de IntelliJ</w:t>
+      </w:r>
+    </w:p>
+    <w:p>
+      <w:pPr>
+        <w:tabs>
+          <w:tab w:val="left" w:pos="7321"/>
+        </w:tabs>
+        <w:rPr>
+          <w:lang w:eastAsia="es-PE"/>
+        </w:rPr>
+      </w:pPr>
+      <w:hyperlink r:id="rId7" w:history="1">
         <w:r>
           <w:rPr>
             <w:rStyle w:val="Hipervnculo"/>
             <w:lang w:eastAsia="es-PE"/>
           </w:rPr>
-          <w:t>https://www.jetbrains.com/es-es/idea/download/?section=windows</w:t>
+          <w:t>https://www.jetbrai</w:t>
+        </w:r>
+        <w:r>
+          <w:rPr>
+            <w:rStyle w:val="Hipervnculo"/>
+            <w:lang w:eastAsia="es-PE"/>
+          </w:rPr>
+          <w:t>n</w:t>
+        </w:r>
+        <w:r>
+          <w:rPr>
+            <w:rStyle w:val="Hipervnculo"/>
+            <w:lang w:eastAsia="es-PE"/>
+          </w:rPr>
+          <w:t>s.com/es-es/idea/download/?section=windows</w:t>
         </w:r>
       </w:hyperlink>
-      <w:r>
-        <w:rPr>
-          <w:lang w:eastAsia="es-PE"/>
-        </w:rPr>
-        <w:tab/>
-      </w:r>
     </w:p>
     <w:p>
       <w:pPr>
@@ -3192,7 +4934,30 @@
           <w:lang w:eastAsia="es-PE"/>
         </w:rPr>
       </w:pPr>
-      <w:hyperlink r:id="rId9" w:history="1">
+      <w:r>
+        <w:rPr>
+          <w:lang w:eastAsia="es-PE"/>
+        </w:rPr>
+        <w:t>Instalación de Visual Studio</w:t>
+      </w:r>
+      <w:r>
+        <w:rPr>
+          <w:lang w:eastAsia="es-PE"/>
+        </w:rPr>
+        <w:tab/>
+      </w:r>
+    </w:p>
+    <w:p>
+      <w:pPr>
+        <w:tabs>
+          <w:tab w:val="left" w:pos="7321"/>
+        </w:tabs>
+        <w:rPr>
+          <w:rStyle w:val="Hipervnculo"/>
+          <w:lang w:eastAsia="es-PE"/>
+        </w:rPr>
+      </w:pPr>
+      <w:hyperlink r:id="rId8" w:history="1">
         <w:r>
           <w:rPr>
             <w:rStyle w:val="Hipervnculo"/>
@@ -3211,25 +4976,53 @@
           <w:lang w:eastAsia="es-PE"/>
         </w:rPr>
       </w:pPr>
-      <w:hyperlink r:id="rId10" w:history="1">
+      <w:r>
+        <w:rPr>
+          <w:lang w:eastAsia="es-PE"/>
+        </w:rPr>
+        <w:t xml:space="preserve">Instalación de </w:t>
+      </w:r>
+      <w:proofErr w:type="spellStart"/>
+      <w:r>
+        <w:rPr>
+          <w:lang w:eastAsia="es-PE"/>
+        </w:rPr>
+        <w:t>Xampp</w:t>
+      </w:r>
+      <w:proofErr w:type="spellEnd"/>
+    </w:p>
+    <w:p>
+      <w:pPr>
+        <w:tabs>
+          <w:tab w:val="left" w:pos="7321"/>
+        </w:tabs>
+        <w:rPr>
+          <w:lang w:eastAsia="es-PE"/>
+        </w:rPr>
+      </w:pPr>
+      <w:hyperlink r:id="rId9" w:history="1">
         <w:r>
           <w:rPr>
             <w:rStyle w:val="Hipervnculo"/>
             <w:lang w:eastAsia="es-PE"/>
           </w:rPr>
-          <w:t>https://www.apachefriends.org/download.html</w:t>
+          <w:t>https://www.apachefrien</w:t>
+        </w:r>
+        <w:r>
+          <w:rPr>
+            <w:rStyle w:val="Hipervnculo"/>
+            <w:lang w:eastAsia="es-PE"/>
+          </w:rPr>
+          <w:t>d</w:t>
+        </w:r>
+        <w:r>
+          <w:rPr>
+            <w:rStyle w:val="Hipervnculo"/>
+            <w:lang w:eastAsia="es-PE"/>
+          </w:rPr>
+          <w:t>s.org/download.html</w:t>
         </w:r>
       </w:hyperlink>
-    </w:p>
-    <w:p>
-      <w:pPr>
-        <w:tabs>
-          <w:tab w:val="left" w:pos="7321"/>
-        </w:tabs>
-        <w:rPr>
-          <w:lang w:eastAsia="es-PE"/>
-        </w:rPr>
-      </w:pPr>
     </w:p>
     <w:p>
       <w:pPr>
@@ -4647,6 +6440,18 @@
       <w:szCs w:val="20"/>
     </w:rPr>
   </w:style>
+  <w:style w:type="character" w:styleId="Hipervnculovisitado">
+    <w:name w:val="FollowedHyperlink"/>
+    <w:basedOn w:val="Fuentedeprrafopredeter"/>
+    <w:uiPriority w:val="99"/>
+    <w:semiHidden/>
+    <w:unhideWhenUsed/>
+    <w:rsid w:val="00C323E8"/>
+    <w:rPr>
+      <w:color w:val="954F72" w:themeColor="followedHyperlink"/>
+      <w:u w:val="single"/>
+    </w:rPr>
+  </w:style>
 </w:styles>
 </file>
 

</xml_diff>